<commit_message>
Agregar galeria de capturas y mini-tutorial de Git al documento explicativo
</commit_message>
<xml_diff>
--- a/Documento Explicativo del Código.docx
+++ b/Documento Explicativo del Código.docx
@@ -9013,6 +9013,1255 @@
           <w:color w:val="0A4D2E"/>
         </w:rPr>
         <w:t>distintos del semestre.</w:t>
+      </w:r>
+    </w:p>
+    <w:p>
+      <w:pPr>
+        <w:spacing w:before="240"/>
+      </w:pPr>
+      <w:r>
+        <w:rPr>
+          <w:rFonts w:ascii="Calibri" w:hAnsi="Calibri" w:eastAsia="Calibri"/>
+          <w:b/>
+          <w:color w:val="1565C0"/>
+          <w:sz w:val="26"/>
+        </w:rPr>
+        <w:t>4.14 Galería de pantallas (así se ve la app)</w:t>
+      </w:r>
+    </w:p>
+    <w:p>
+      <w:r>
+        <w:rPr>
+          <w:rFonts w:ascii="Calibri" w:hAnsi="Calibri" w:eastAsia="Calibri"/>
+          <w:b w:val="0"/>
+          <w:i w:val="0"/>
+        </w:rPr>
+        <w:t xml:space="preserve">Estas son las capturas reales de la app. Usa esta galería para </w:t>
+      </w:r>
+      <w:r>
+        <w:rPr>
+          <w:rFonts w:ascii="Calibri" w:hAnsi="Calibri" w:eastAsia="Calibri"/>
+          <w:b/>
+          <w:i w:val="0"/>
+        </w:rPr>
+      </w:r>
+      <w:r>
+        <w:rPr>
+          <w:rFonts w:ascii="Calibri" w:hAnsi="Calibri" w:eastAsia="Calibri"/>
+          <w:b w:val="0"/>
+          <w:i w:val="0"/>
+        </w:rPr>
+        <w:t>identificar cada</w:t>
+      </w:r>
+    </w:p>
+    <w:p>
+      <w:r>
+        <w:rPr>
+          <w:rFonts w:ascii="Calibri" w:hAnsi="Calibri" w:eastAsia="Calibri"/>
+          <w:b w:val="0"/>
+          <w:i w:val="0"/>
+        </w:rPr>
+        <w:t>pantalla por su nombre</w:t>
+      </w:r>
+      <w:r>
+        <w:rPr>
+          <w:rFonts w:ascii="Calibri" w:hAnsi="Calibri" w:eastAsia="Calibri"/>
+          <w:b/>
+          <w:i w:val="0"/>
+        </w:rPr>
+      </w:r>
+      <w:r>
+        <w:rPr>
+          <w:rFonts w:ascii="Calibri" w:hAnsi="Calibri" w:eastAsia="Calibri"/>
+          <w:b w:val="0"/>
+          <w:i w:val="0"/>
+        </w:rPr>
+        <w:t xml:space="preserve"> y para practicar </w:t>
+      </w:r>
+      <w:r>
+        <w:rPr>
+          <w:rFonts w:ascii="Calibri" w:hAnsi="Calibri" w:eastAsia="Calibri"/>
+          <w:b w:val="0"/>
+          <w:i/>
+        </w:rPr>
+        <w:t>antes</w:t>
+      </w:r>
+      <w:r>
+        <w:rPr>
+          <w:rFonts w:ascii="Calibri" w:hAnsi="Calibri" w:eastAsia="Calibri"/>
+          <w:b w:val="0"/>
+          <w:i w:val="0"/>
+        </w:rPr>
+        <w:t xml:space="preserve"> de abrir el código. Así, cuando leas</w:t>
+      </w:r>
+    </w:p>
+    <w:p>
+      <w:r>
+        <w:rPr>
+          <w:rFonts w:ascii="Calibri" w:hAnsi="Calibri" w:eastAsia="Calibri"/>
+          <w:b w:val="0"/>
+          <w:i w:val="0"/>
+        </w:rPr>
+        <w:t>un archivo (</w:t>
+      </w:r>
+      <w:r>
+        <w:rPr>
+          <w:rFonts w:ascii="Consolas" w:hAnsi="Consolas" w:eastAsia="Consolas"/>
+          <w:b w:val="0"/>
+          <w:i w:val="0"/>
+          <w:color w:val="0A2342"/>
+          <w:sz w:val="21"/>
+        </w:rPr>
+        <w:t>splash_screen.py</w:t>
+      </w:r>
+      <w:r>
+        <w:rPr>
+          <w:rFonts w:ascii="Calibri" w:hAnsi="Calibri" w:eastAsia="Calibri"/>
+          <w:b w:val="0"/>
+          <w:i w:val="0"/>
+        </w:rPr>
+        <w:t xml:space="preserve">, </w:t>
+      </w:r>
+      <w:r>
+        <w:rPr>
+          <w:rFonts w:ascii="Consolas" w:hAnsi="Consolas" w:eastAsia="Consolas"/>
+          <w:b w:val="0"/>
+          <w:i w:val="0"/>
+          <w:color w:val="0A2342"/>
+          <w:sz w:val="21"/>
+        </w:rPr>
+        <w:t>login_screen.py</w:t>
+      </w:r>
+      <w:r>
+        <w:rPr>
+          <w:rFonts w:ascii="Calibri" w:hAnsi="Calibri" w:eastAsia="Calibri"/>
+          <w:b w:val="0"/>
+          <w:i w:val="0"/>
+        </w:rPr>
+        <w:t>, etc.), ya sabrás exactamente cómo se</w:t>
+      </w:r>
+    </w:p>
+    <w:p>
+      <w:r>
+        <w:rPr>
+          <w:rFonts w:ascii="Calibri" w:hAnsi="Calibri" w:eastAsia="Calibri"/>
+          <w:b w:val="0"/>
+          <w:i w:val="0"/>
+        </w:rPr>
+        <w:t>ve esa pantalla.</w:t>
+      </w:r>
+    </w:p>
+    <w:tbl>
+      <w:tblPr>
+        <w:tblStyle w:val="LightGrid-Accent1"/>
+        <w:tblW w:type="auto" w:w="0"/>
+        <w:tblLook w:firstColumn="1" w:firstRow="1" w:lastColumn="0" w:lastRow="0" w:noHBand="0" w:noVBand="1" w:val="04A0"/>
+      </w:tblPr>
+      <w:tblGrid>
+        <w:gridCol w:w="2160"/>
+        <w:gridCol w:w="2160"/>
+        <w:gridCol w:w="2160"/>
+        <w:gridCol w:w="2160"/>
+      </w:tblGrid>
+      <w:tr>
+        <w:tc>
+          <w:tcPr>
+            <w:tcW w:type="dxa" w:w="2160"/>
+          </w:tcPr>
+          <w:p>
+            <w:r/>
+            <w:r>
+              <w:rPr>
+                <w:b/>
+                <w:sz w:val="19"/>
+              </w:rPr>
+              <w:t>N.º</w:t>
+            </w:r>
+          </w:p>
+        </w:tc>
+        <w:tc>
+          <w:tcPr>
+            <w:tcW w:type="dxa" w:w="2160"/>
+          </w:tcPr>
+          <w:p>
+            <w:r/>
+            <w:r>
+              <w:rPr>
+                <w:b/>
+                <w:sz w:val="19"/>
+              </w:rPr>
+              <w:t>Captura</w:t>
+            </w:r>
+          </w:p>
+        </w:tc>
+        <w:tc>
+          <w:tcPr>
+            <w:tcW w:type="dxa" w:w="2160"/>
+          </w:tcPr>
+          <w:p>
+            <w:r/>
+            <w:r>
+              <w:rPr>
+                <w:b/>
+                <w:sz w:val="19"/>
+              </w:rPr>
+              <w:t>Pantalla</w:t>
+            </w:r>
+          </w:p>
+        </w:tc>
+        <w:tc>
+          <w:tcPr>
+            <w:tcW w:type="dxa" w:w="2160"/>
+          </w:tcPr>
+          <w:p>
+            <w:r/>
+            <w:r>
+              <w:rPr>
+                <w:b/>
+                <w:sz w:val="19"/>
+              </w:rPr>
+              <w:t>Archivo donde está el código</w:t>
+            </w:r>
+          </w:p>
+        </w:tc>
+      </w:tr>
+      <w:tr>
+        <w:tc>
+          <w:tcPr>
+            <w:tcW w:type="dxa" w:w="2160"/>
+          </w:tcPr>
+          <w:p>
+            <w:r/>
+            <w:r>
+              <w:rPr>
+                <w:sz w:val="19"/>
+              </w:rPr>
+              <w:t>1</w:t>
+            </w:r>
+          </w:p>
+        </w:tc>
+        <w:tc>
+          <w:tcPr>
+            <w:tcW w:type="dxa" w:w="2160"/>
+          </w:tcPr>
+          <w:p>
+            <w:pPr>
+              <w:jc w:val="center"/>
+            </w:pPr>
+            <w:r/>
+            <w:r>
+              <w:drawing>
+                <wp:inline xmlns:a="http://schemas.openxmlformats.org/drawingml/2006/main" xmlns:pic="http://schemas.openxmlformats.org/drawingml/2006/picture">
+                  <wp:extent cx="1188720" cy="2573975"/>
+                  <wp:docPr id="1" name="Picture 1"/>
+                  <wp:cNvGraphicFramePr>
+                    <a:graphicFrameLocks noChangeAspect="1"/>
+                  </wp:cNvGraphicFramePr>
+                  <a:graphic>
+                    <a:graphicData uri="http://schemas.openxmlformats.org/drawingml/2006/picture">
+                      <pic:pic>
+                        <pic:nvPicPr>
+                          <pic:cNvPr id="0" name="01_splash.png"/>
+                          <pic:cNvPicPr/>
+                        </pic:nvPicPr>
+                        <pic:blipFill>
+                          <a:blip r:embed="rId9"/>
+                          <a:stretch>
+                            <a:fillRect/>
+                          </a:stretch>
+                        </pic:blipFill>
+                        <pic:spPr>
+                          <a:xfrm>
+                            <a:off x="0" y="0"/>
+                            <a:ext cx="1188720" cy="2573975"/>
+                          </a:xfrm>
+                          <a:prstGeom prst="rect"/>
+                        </pic:spPr>
+                      </pic:pic>
+                    </a:graphicData>
+                  </a:graphic>
+                </wp:inline>
+              </w:drawing>
+            </w:r>
+          </w:p>
+        </w:tc>
+        <w:tc>
+          <w:tcPr>
+            <w:tcW w:type="dxa" w:w="2160"/>
+          </w:tcPr>
+          <w:p>
+            <w:r/>
+            <w:r>
+              <w:rPr>
+                <w:sz w:val="19"/>
+              </w:rPr>
+              <w:t>Pantalla de carga con el logo animado</w:t>
+            </w:r>
+          </w:p>
+        </w:tc>
+        <w:tc>
+          <w:tcPr>
+            <w:tcW w:type="dxa" w:w="2160"/>
+          </w:tcPr>
+          <w:p>
+            <w:r/>
+            <w:r>
+              <w:rPr>
+                <w:sz w:val="19"/>
+              </w:rPr>
+              <w:t>screens/splash_screen.py</w:t>
+            </w:r>
+          </w:p>
+        </w:tc>
+      </w:tr>
+      <w:tr>
+        <w:tc>
+          <w:tcPr>
+            <w:tcW w:type="dxa" w:w="2160"/>
+          </w:tcPr>
+          <w:p>
+            <w:r/>
+            <w:r>
+              <w:rPr>
+                <w:sz w:val="19"/>
+              </w:rPr>
+              <w:t>2</w:t>
+            </w:r>
+          </w:p>
+        </w:tc>
+        <w:tc>
+          <w:tcPr>
+            <w:tcW w:type="dxa" w:w="2160"/>
+          </w:tcPr>
+          <w:p>
+            <w:pPr>
+              <w:jc w:val="center"/>
+            </w:pPr>
+            <w:r/>
+            <w:r>
+              <w:drawing>
+                <wp:inline xmlns:a="http://schemas.openxmlformats.org/drawingml/2006/main" xmlns:pic="http://schemas.openxmlformats.org/drawingml/2006/picture">
+                  <wp:extent cx="1188720" cy="2573975"/>
+                  <wp:docPr id="2" name="Picture 2"/>
+                  <wp:cNvGraphicFramePr>
+                    <a:graphicFrameLocks noChangeAspect="1"/>
+                  </wp:cNvGraphicFramePr>
+                  <a:graphic>
+                    <a:graphicData uri="http://schemas.openxmlformats.org/drawingml/2006/picture">
+                      <pic:pic>
+                        <pic:nvPicPr>
+                          <pic:cNvPr id="0" name="02_inicio.png"/>
+                          <pic:cNvPicPr/>
+                        </pic:nvPicPr>
+                        <pic:blipFill>
+                          <a:blip r:embed="rId10"/>
+                          <a:stretch>
+                            <a:fillRect/>
+                          </a:stretch>
+                        </pic:blipFill>
+                        <pic:spPr>
+                          <a:xfrm>
+                            <a:off x="0" y="0"/>
+                            <a:ext cx="1188720" cy="2573975"/>
+                          </a:xfrm>
+                          <a:prstGeom prst="rect"/>
+                        </pic:spPr>
+                      </pic:pic>
+                    </a:graphicData>
+                  </a:graphic>
+                </wp:inline>
+              </w:drawing>
+            </w:r>
+          </w:p>
+        </w:tc>
+        <w:tc>
+          <w:tcPr>
+            <w:tcW w:type="dxa" w:w="2160"/>
+          </w:tcPr>
+          <w:p>
+            <w:r/>
+            <w:r>
+              <w:rPr>
+                <w:sz w:val="19"/>
+              </w:rPr>
+              <w:t>Bienvenida con botones</w:t>
+            </w:r>
+          </w:p>
+        </w:tc>
+        <w:tc>
+          <w:tcPr>
+            <w:tcW w:type="dxa" w:w="2160"/>
+          </w:tcPr>
+          <w:p>
+            <w:r/>
+            <w:r>
+              <w:rPr>
+                <w:sz w:val="19"/>
+              </w:rPr>
+              <w:t>screens/inicio_screen.py</w:t>
+            </w:r>
+          </w:p>
+        </w:tc>
+      </w:tr>
+      <w:tr>
+        <w:tc>
+          <w:tcPr>
+            <w:tcW w:type="dxa" w:w="2160"/>
+          </w:tcPr>
+          <w:p>
+            <w:r/>
+            <w:r>
+              <w:rPr>
+                <w:sz w:val="19"/>
+              </w:rPr>
+              <w:t>3</w:t>
+            </w:r>
+          </w:p>
+        </w:tc>
+        <w:tc>
+          <w:tcPr>
+            <w:tcW w:type="dxa" w:w="2160"/>
+          </w:tcPr>
+          <w:p>
+            <w:pPr>
+              <w:jc w:val="center"/>
+            </w:pPr>
+            <w:r/>
+            <w:r>
+              <w:drawing>
+                <wp:inline xmlns:a="http://schemas.openxmlformats.org/drawingml/2006/main" xmlns:pic="http://schemas.openxmlformats.org/drawingml/2006/picture">
+                  <wp:extent cx="1188720" cy="2573975"/>
+                  <wp:docPr id="3" name="Picture 3"/>
+                  <wp:cNvGraphicFramePr>
+                    <a:graphicFrameLocks noChangeAspect="1"/>
+                  </wp:cNvGraphicFramePr>
+                  <a:graphic>
+                    <a:graphicData uri="http://schemas.openxmlformats.org/drawingml/2006/picture">
+                      <pic:pic>
+                        <pic:nvPicPr>
+                          <pic:cNvPr id="0" name="03_login.png"/>
+                          <pic:cNvPicPr/>
+                        </pic:nvPicPr>
+                        <pic:blipFill>
+                          <a:blip r:embed="rId11"/>
+                          <a:stretch>
+                            <a:fillRect/>
+                          </a:stretch>
+                        </pic:blipFill>
+                        <pic:spPr>
+                          <a:xfrm>
+                            <a:off x="0" y="0"/>
+                            <a:ext cx="1188720" cy="2573975"/>
+                          </a:xfrm>
+                          <a:prstGeom prst="rect"/>
+                        </pic:spPr>
+                      </pic:pic>
+                    </a:graphicData>
+                  </a:graphic>
+                </wp:inline>
+              </w:drawing>
+            </w:r>
+          </w:p>
+        </w:tc>
+        <w:tc>
+          <w:tcPr>
+            <w:tcW w:type="dxa" w:w="2160"/>
+          </w:tcPr>
+          <w:p>
+            <w:r/>
+            <w:r>
+              <w:rPr>
+                <w:sz w:val="19"/>
+              </w:rPr>
+              <w:t>Iniciar sesión</w:t>
+            </w:r>
+          </w:p>
+        </w:tc>
+        <w:tc>
+          <w:tcPr>
+            <w:tcW w:type="dxa" w:w="2160"/>
+          </w:tcPr>
+          <w:p>
+            <w:r/>
+            <w:r>
+              <w:rPr>
+                <w:sz w:val="19"/>
+              </w:rPr>
+              <w:t>screens/login_screen.py</w:t>
+            </w:r>
+          </w:p>
+        </w:tc>
+      </w:tr>
+      <w:tr>
+        <w:tc>
+          <w:tcPr>
+            <w:tcW w:type="dxa" w:w="2160"/>
+          </w:tcPr>
+          <w:p>
+            <w:r/>
+            <w:r>
+              <w:rPr>
+                <w:sz w:val="19"/>
+              </w:rPr>
+              <w:t>4</w:t>
+            </w:r>
+          </w:p>
+        </w:tc>
+        <w:tc>
+          <w:tcPr>
+            <w:tcW w:type="dxa" w:w="2160"/>
+          </w:tcPr>
+          <w:p>
+            <w:pPr>
+              <w:jc w:val="center"/>
+            </w:pPr>
+            <w:r/>
+            <w:r>
+              <w:drawing>
+                <wp:inline xmlns:a="http://schemas.openxmlformats.org/drawingml/2006/main" xmlns:pic="http://schemas.openxmlformats.org/drawingml/2006/picture">
+                  <wp:extent cx="1188720" cy="2573975"/>
+                  <wp:docPr id="4" name="Picture 4"/>
+                  <wp:cNvGraphicFramePr>
+                    <a:graphicFrameLocks noChangeAspect="1"/>
+                  </wp:cNvGraphicFramePr>
+                  <a:graphic>
+                    <a:graphicData uri="http://schemas.openxmlformats.org/drawingml/2006/picture">
+                      <pic:pic>
+                        <pic:nvPicPr>
+                          <pic:cNvPr id="0" name="04_registro.png"/>
+                          <pic:cNvPicPr/>
+                        </pic:nvPicPr>
+                        <pic:blipFill>
+                          <a:blip r:embed="rId12"/>
+                          <a:stretch>
+                            <a:fillRect/>
+                          </a:stretch>
+                        </pic:blipFill>
+                        <pic:spPr>
+                          <a:xfrm>
+                            <a:off x="0" y="0"/>
+                            <a:ext cx="1188720" cy="2573975"/>
+                          </a:xfrm>
+                          <a:prstGeom prst="rect"/>
+                        </pic:spPr>
+                      </pic:pic>
+                    </a:graphicData>
+                  </a:graphic>
+                </wp:inline>
+              </w:drawing>
+            </w:r>
+          </w:p>
+        </w:tc>
+        <w:tc>
+          <w:tcPr>
+            <w:tcW w:type="dxa" w:w="2160"/>
+          </w:tcPr>
+          <w:p>
+            <w:r/>
+            <w:r>
+              <w:rPr>
+                <w:sz w:val="19"/>
+              </w:rPr>
+              <w:t>Crear cuenta</w:t>
+            </w:r>
+          </w:p>
+        </w:tc>
+        <w:tc>
+          <w:tcPr>
+            <w:tcW w:type="dxa" w:w="2160"/>
+          </w:tcPr>
+          <w:p>
+            <w:r/>
+            <w:r>
+              <w:rPr>
+                <w:sz w:val="19"/>
+              </w:rPr>
+              <w:t>screens/registro_screen.py</w:t>
+            </w:r>
+          </w:p>
+        </w:tc>
+      </w:tr>
+      <w:tr>
+        <w:tc>
+          <w:tcPr>
+            <w:tcW w:type="dxa" w:w="2160"/>
+          </w:tcPr>
+          <w:p>
+            <w:r/>
+            <w:r>
+              <w:rPr>
+                <w:sz w:val="19"/>
+              </w:rPr>
+              <w:t>5</w:t>
+            </w:r>
+          </w:p>
+        </w:tc>
+        <w:tc>
+          <w:tcPr>
+            <w:tcW w:type="dxa" w:w="2160"/>
+          </w:tcPr>
+          <w:p>
+            <w:pPr>
+              <w:jc w:val="center"/>
+            </w:pPr>
+            <w:r/>
+            <w:r>
+              <w:drawing>
+                <wp:inline xmlns:a="http://schemas.openxmlformats.org/drawingml/2006/main" xmlns:pic="http://schemas.openxmlformats.org/drawingml/2006/picture">
+                  <wp:extent cx="1188720" cy="2573975"/>
+                  <wp:docPr id="5" name="Picture 5"/>
+                  <wp:cNvGraphicFramePr>
+                    <a:graphicFrameLocks noChangeAspect="1"/>
+                  </wp:cNvGraphicFramePr>
+                  <a:graphic>
+                    <a:graphicData uri="http://schemas.openxmlformats.org/drawingml/2006/picture">
+                      <pic:pic>
+                        <pic:nvPicPr>
+                          <pic:cNvPr id="0" name="05_home.png"/>
+                          <pic:cNvPicPr/>
+                        </pic:nvPicPr>
+                        <pic:blipFill>
+                          <a:blip r:embed="rId13"/>
+                          <a:stretch>
+                            <a:fillRect/>
+                          </a:stretch>
+                        </pic:blipFill>
+                        <pic:spPr>
+                          <a:xfrm>
+                            <a:off x="0" y="0"/>
+                            <a:ext cx="1188720" cy="2573975"/>
+                          </a:xfrm>
+                          <a:prstGeom prst="rect"/>
+                        </pic:spPr>
+                      </pic:pic>
+                    </a:graphicData>
+                  </a:graphic>
+                </wp:inline>
+              </w:drawing>
+            </w:r>
+          </w:p>
+        </w:tc>
+        <w:tc>
+          <w:tcPr>
+            <w:tcW w:type="dxa" w:w="2160"/>
+          </w:tcPr>
+          <w:p>
+            <w:r/>
+            <w:r>
+              <w:rPr>
+                <w:sz w:val="19"/>
+              </w:rPr>
+              <w:t>Panel de control</w:t>
+            </w:r>
+          </w:p>
+        </w:tc>
+        <w:tc>
+          <w:tcPr>
+            <w:tcW w:type="dxa" w:w="2160"/>
+          </w:tcPr>
+          <w:p>
+            <w:r/>
+            <w:r>
+              <w:rPr>
+                <w:sz w:val="19"/>
+              </w:rPr>
+              <w:t>screens/home_screen.py</w:t>
+            </w:r>
+          </w:p>
+        </w:tc>
+      </w:tr>
+      <w:tr>
+        <w:tc>
+          <w:tcPr>
+            <w:tcW w:type="dxa" w:w="2160"/>
+          </w:tcPr>
+          <w:p>
+            <w:r/>
+            <w:r>
+              <w:rPr>
+                <w:sz w:val="19"/>
+              </w:rPr>
+              <w:t>6</w:t>
+            </w:r>
+          </w:p>
+        </w:tc>
+        <w:tc>
+          <w:tcPr>
+            <w:tcW w:type="dxa" w:w="2160"/>
+          </w:tcPr>
+          <w:p>
+            <w:pPr>
+              <w:jc w:val="center"/>
+            </w:pPr>
+            <w:r/>
+            <w:r>
+              <w:drawing>
+                <wp:inline xmlns:a="http://schemas.openxmlformats.org/drawingml/2006/main" xmlns:pic="http://schemas.openxmlformats.org/drawingml/2006/picture">
+                  <wp:extent cx="1188720" cy="2573975"/>
+                  <wp:docPr id="6" name="Picture 6"/>
+                  <wp:cNvGraphicFramePr>
+                    <a:graphicFrameLocks noChangeAspect="1"/>
+                  </wp:cNvGraphicFramePr>
+                  <a:graphic>
+                    <a:graphicData uri="http://schemas.openxmlformats.org/drawingml/2006/picture">
+                      <pic:pic>
+                        <pic:nvPicPr>
+                          <pic:cNvPr id="0" name="06_citas.png"/>
+                          <pic:cNvPicPr/>
+                        </pic:nvPicPr>
+                        <pic:blipFill>
+                          <a:blip r:embed="rId14"/>
+                          <a:stretch>
+                            <a:fillRect/>
+                          </a:stretch>
+                        </pic:blipFill>
+                        <pic:spPr>
+                          <a:xfrm>
+                            <a:off x="0" y="0"/>
+                            <a:ext cx="1188720" cy="2573975"/>
+                          </a:xfrm>
+                          <a:prstGeom prst="rect"/>
+                        </pic:spPr>
+                      </pic:pic>
+                    </a:graphicData>
+                  </a:graphic>
+                </wp:inline>
+              </w:drawing>
+            </w:r>
+          </w:p>
+        </w:tc>
+        <w:tc>
+          <w:tcPr>
+            <w:tcW w:type="dxa" w:w="2160"/>
+          </w:tcPr>
+          <w:p>
+            <w:r/>
+            <w:r>
+              <w:rPr>
+                <w:sz w:val="19"/>
+              </w:rPr>
+              <w:t>Citas médicas</w:t>
+            </w:r>
+          </w:p>
+        </w:tc>
+        <w:tc>
+          <w:tcPr>
+            <w:tcW w:type="dxa" w:w="2160"/>
+          </w:tcPr>
+          <w:p>
+            <w:r/>
+            <w:r>
+              <w:rPr>
+                <w:sz w:val="19"/>
+              </w:rPr>
+              <w:t>screens/citas_screen.py</w:t>
+            </w:r>
+          </w:p>
+        </w:tc>
+      </w:tr>
+      <w:tr>
+        <w:tc>
+          <w:tcPr>
+            <w:tcW w:type="dxa" w:w="2160"/>
+          </w:tcPr>
+          <w:p>
+            <w:r/>
+            <w:r>
+              <w:rPr>
+                <w:sz w:val="19"/>
+              </w:rPr>
+              <w:t>7</w:t>
+            </w:r>
+          </w:p>
+        </w:tc>
+        <w:tc>
+          <w:tcPr>
+            <w:tcW w:type="dxa" w:w="2160"/>
+          </w:tcPr>
+          <w:p>
+            <w:pPr>
+              <w:jc w:val="center"/>
+            </w:pPr>
+            <w:r/>
+            <w:r>
+              <w:drawing>
+                <wp:inline xmlns:a="http://schemas.openxmlformats.org/drawingml/2006/main" xmlns:pic="http://schemas.openxmlformats.org/drawingml/2006/picture">
+                  <wp:extent cx="1188720" cy="2573975"/>
+                  <wp:docPr id="7" name="Picture 7"/>
+                  <wp:cNvGraphicFramePr>
+                    <a:graphicFrameLocks noChangeAspect="1"/>
+                  </wp:cNvGraphicFramePr>
+                  <a:graphic>
+                    <a:graphicData uri="http://schemas.openxmlformats.org/drawingml/2006/picture">
+                      <pic:pic>
+                        <pic:nvPicPr>
+                          <pic:cNvPr id="0" name="07_historial.png"/>
+                          <pic:cNvPicPr/>
+                        </pic:nvPicPr>
+                        <pic:blipFill>
+                          <a:blip r:embed="rId15"/>
+                          <a:stretch>
+                            <a:fillRect/>
+                          </a:stretch>
+                        </pic:blipFill>
+                        <pic:spPr>
+                          <a:xfrm>
+                            <a:off x="0" y="0"/>
+                            <a:ext cx="1188720" cy="2573975"/>
+                          </a:xfrm>
+                          <a:prstGeom prst="rect"/>
+                        </pic:spPr>
+                      </pic:pic>
+                    </a:graphicData>
+                  </a:graphic>
+                </wp:inline>
+              </w:drawing>
+            </w:r>
+          </w:p>
+        </w:tc>
+        <w:tc>
+          <w:tcPr>
+            <w:tcW w:type="dxa" w:w="2160"/>
+          </w:tcPr>
+          <w:p>
+            <w:r/>
+            <w:r>
+              <w:rPr>
+                <w:sz w:val="19"/>
+              </w:rPr>
+              <w:t>Historial médico</w:t>
+            </w:r>
+          </w:p>
+        </w:tc>
+        <w:tc>
+          <w:tcPr>
+            <w:tcW w:type="dxa" w:w="2160"/>
+          </w:tcPr>
+          <w:p>
+            <w:r/>
+            <w:r>
+              <w:rPr>
+                <w:sz w:val="19"/>
+              </w:rPr>
+              <w:t>screens/historial_screen.py</w:t>
+            </w:r>
+          </w:p>
+        </w:tc>
+      </w:tr>
+      <w:tr>
+        <w:tc>
+          <w:tcPr>
+            <w:tcW w:type="dxa" w:w="2160"/>
+          </w:tcPr>
+          <w:p>
+            <w:r/>
+            <w:r>
+              <w:rPr>
+                <w:sz w:val="19"/>
+              </w:rPr>
+              <w:t>8</w:t>
+            </w:r>
+          </w:p>
+        </w:tc>
+        <w:tc>
+          <w:tcPr>
+            <w:tcW w:type="dxa" w:w="2160"/>
+          </w:tcPr>
+          <w:p>
+            <w:pPr>
+              <w:jc w:val="center"/>
+            </w:pPr>
+            <w:r/>
+            <w:r>
+              <w:drawing>
+                <wp:inline xmlns:a="http://schemas.openxmlformats.org/drawingml/2006/main" xmlns:pic="http://schemas.openxmlformats.org/drawingml/2006/picture">
+                  <wp:extent cx="1188720" cy="2573975"/>
+                  <wp:docPr id="8" name="Picture 8"/>
+                  <wp:cNvGraphicFramePr>
+                    <a:graphicFrameLocks noChangeAspect="1"/>
+                  </wp:cNvGraphicFramePr>
+                  <a:graphic>
+                    <a:graphicData uri="http://schemas.openxmlformats.org/drawingml/2006/picture">
+                      <pic:pic>
+                        <pic:nvPicPr>
+                          <pic:cNvPr id="0" name="08_formmed.png"/>
+                          <pic:cNvPicPr/>
+                        </pic:nvPicPr>
+                        <pic:blipFill>
+                          <a:blip r:embed="rId16"/>
+                          <a:stretch>
+                            <a:fillRect/>
+                          </a:stretch>
+                        </pic:blipFill>
+                        <pic:spPr>
+                          <a:xfrm>
+                            <a:off x="0" y="0"/>
+                            <a:ext cx="1188720" cy="2573975"/>
+                          </a:xfrm>
+                          <a:prstGeom prst="rect"/>
+                        </pic:spPr>
+                      </pic:pic>
+                    </a:graphicData>
+                  </a:graphic>
+                </wp:inline>
+              </w:drawing>
+            </w:r>
+          </w:p>
+        </w:tc>
+        <w:tc>
+          <w:tcPr>
+            <w:tcW w:type="dxa" w:w="2160"/>
+          </w:tcPr>
+          <w:p>
+            <w:r/>
+            <w:r>
+              <w:rPr>
+                <w:sz w:val="19"/>
+              </w:rPr>
+              <w:t>Agregar medicamento</w:t>
+            </w:r>
+          </w:p>
+        </w:tc>
+        <w:tc>
+          <w:tcPr>
+            <w:tcW w:type="dxa" w:w="2160"/>
+          </w:tcPr>
+          <w:p>
+            <w:r/>
+            <w:r>
+              <w:rPr>
+                <w:sz w:val="19"/>
+              </w:rPr>
+              <w:t>screens/forms/form_medicamento.py</w:t>
+            </w:r>
+          </w:p>
+        </w:tc>
+      </w:tr>
+      <w:tr>
+        <w:tc>
+          <w:tcPr>
+            <w:tcW w:type="dxa" w:w="2160"/>
+          </w:tcPr>
+          <w:p>
+            <w:r/>
+            <w:r>
+              <w:rPr>
+                <w:sz w:val="19"/>
+              </w:rPr>
+              <w:t>9</w:t>
+            </w:r>
+          </w:p>
+        </w:tc>
+        <w:tc>
+          <w:tcPr>
+            <w:tcW w:type="dxa" w:w="2160"/>
+          </w:tcPr>
+          <w:p>
+            <w:pPr>
+              <w:jc w:val="center"/>
+            </w:pPr>
+            <w:r/>
+            <w:r>
+              <w:drawing>
+                <wp:inline xmlns:a="http://schemas.openxmlformats.org/drawingml/2006/main" xmlns:pic="http://schemas.openxmlformats.org/drawingml/2006/picture">
+                  <wp:extent cx="1188720" cy="2573975"/>
+                  <wp:docPr id="9" name="Picture 9"/>
+                  <wp:cNvGraphicFramePr>
+                    <a:graphicFrameLocks noChangeAspect="1"/>
+                  </wp:cNvGraphicFramePr>
+                  <a:graphic>
+                    <a:graphicData uri="http://schemas.openxmlformats.org/drawingml/2006/picture">
+                      <pic:pic>
+                        <pic:nvPicPr>
+                          <pic:cNvPr id="0" name="09_formreg.png"/>
+                          <pic:cNvPicPr/>
+                        </pic:nvPicPr>
+                        <pic:blipFill>
+                          <a:blip r:embed="rId17"/>
+                          <a:stretch>
+                            <a:fillRect/>
+                          </a:stretch>
+                        </pic:blipFill>
+                        <pic:spPr>
+                          <a:xfrm>
+                            <a:off x="0" y="0"/>
+                            <a:ext cx="1188720" cy="2573975"/>
+                          </a:xfrm>
+                          <a:prstGeom prst="rect"/>
+                        </pic:spPr>
+                      </pic:pic>
+                    </a:graphicData>
+                  </a:graphic>
+                </wp:inline>
+              </w:drawing>
+            </w:r>
+          </w:p>
+        </w:tc>
+        <w:tc>
+          <w:tcPr>
+            <w:tcW w:type="dxa" w:w="2160"/>
+          </w:tcPr>
+          <w:p>
+            <w:r/>
+            <w:r>
+              <w:rPr>
+                <w:sz w:val="19"/>
+              </w:rPr>
+              <w:t>Editar perfil</w:t>
+            </w:r>
+          </w:p>
+        </w:tc>
+        <w:tc>
+          <w:tcPr>
+            <w:tcW w:type="dxa" w:w="2160"/>
+          </w:tcPr>
+          <w:p>
+            <w:r/>
+            <w:r>
+              <w:rPr>
+                <w:sz w:val="19"/>
+              </w:rPr>
+              <w:t>screens/forms/form_registro.py</w:t>
+            </w:r>
+          </w:p>
+        </w:tc>
+      </w:tr>
+      <w:tr>
+        <w:tc>
+          <w:tcPr>
+            <w:tcW w:type="dxa" w:w="2160"/>
+          </w:tcPr>
+          <w:p>
+            <w:r/>
+            <w:r>
+              <w:rPr>
+                <w:sz w:val="19"/>
+              </w:rPr>
+              <w:t>10</w:t>
+            </w:r>
+          </w:p>
+        </w:tc>
+        <w:tc>
+          <w:tcPr>
+            <w:tcW w:type="dxa" w:w="2160"/>
+          </w:tcPr>
+          <w:p>
+            <w:pPr>
+              <w:jc w:val="center"/>
+            </w:pPr>
+            <w:r/>
+            <w:r>
+              <w:drawing>
+                <wp:inline xmlns:a="http://schemas.openxmlformats.org/drawingml/2006/main" xmlns:pic="http://schemas.openxmlformats.org/drawingml/2006/picture">
+                  <wp:extent cx="1188720" cy="2573975"/>
+                  <wp:docPr id="10" name="Picture 10"/>
+                  <wp:cNvGraphicFramePr>
+                    <a:graphicFrameLocks noChangeAspect="1"/>
+                  </wp:cNvGraphicFramePr>
+                  <a:graphic>
+                    <a:graphicData uri="http://schemas.openxmlformats.org/drawingml/2006/picture">
+                      <pic:pic>
+                        <pic:nvPicPr>
+                          <pic:cNvPr id="0" name="10_otp.png"/>
+                          <pic:cNvPicPr/>
+                        </pic:nvPicPr>
+                        <pic:blipFill>
+                          <a:blip r:embed="rId18"/>
+                          <a:stretch>
+                            <a:fillRect/>
+                          </a:stretch>
+                        </pic:blipFill>
+                        <pic:spPr>
+                          <a:xfrm>
+                            <a:off x="0" y="0"/>
+                            <a:ext cx="1188720" cy="2573975"/>
+                          </a:xfrm>
+                          <a:prstGeom prst="rect"/>
+                        </pic:spPr>
+                      </pic:pic>
+                    </a:graphicData>
+                  </a:graphic>
+                </wp:inline>
+              </w:drawing>
+            </w:r>
+          </w:p>
+        </w:tc>
+        <w:tc>
+          <w:tcPr>
+            <w:tcW w:type="dxa" w:w="2160"/>
+          </w:tcPr>
+          <w:p>
+            <w:r/>
+            <w:r>
+              <w:rPr>
+                <w:sz w:val="19"/>
+              </w:rPr>
+              <w:t>Restablecer contraseña (OTP)</w:t>
+            </w:r>
+          </w:p>
+        </w:tc>
+        <w:tc>
+          <w:tcPr>
+            <w:tcW w:type="dxa" w:w="2160"/>
+          </w:tcPr>
+          <w:p>
+            <w:r/>
+            <w:r>
+              <w:rPr>
+                <w:sz w:val="19"/>
+              </w:rPr>
+              <w:t>screens/password_reset/screen_2_otp.py</w:t>
+            </w:r>
+          </w:p>
+        </w:tc>
+      </w:tr>
+    </w:tbl>
+    <w:p>
+      <w:r>
+        <w:rPr>
+          <w:rFonts w:ascii="Calibri" w:hAnsi="Calibri" w:eastAsia="Calibri"/>
+          <w:b w:val="0"/>
+          <w:i w:val="0"/>
+        </w:rPr>
+        <w:t xml:space="preserve">La </w:t>
+      </w:r>
+      <w:r>
+        <w:rPr>
+          <w:rFonts w:ascii="Calibri" w:hAnsi="Calibri" w:eastAsia="Calibri"/>
+          <w:b/>
+          <w:i w:val="0"/>
+        </w:rPr>
+        <w:t>ruta al código</w:t>
+      </w:r>
+      <w:r>
+        <w:rPr>
+          <w:rFonts w:ascii="Calibri" w:hAnsi="Calibri" w:eastAsia="Calibri"/>
+          <w:b w:val="0"/>
+          <w:i w:val="0"/>
+        </w:rPr>
+        <w:t xml:space="preserve"> que aparece en la tabla es la carpeta donde vive cada pantalla.</w:t>
+      </w:r>
+    </w:p>
+    <w:p>
+      <w:r>
+        <w:rPr>
+          <w:rFonts w:ascii="Calibri" w:hAnsi="Calibri" w:eastAsia="Calibri"/>
+          <w:b w:val="0"/>
+          <w:i w:val="0"/>
+        </w:rPr>
+        <w:t xml:space="preserve">Por ejemplo, para abrir la pantalla del login buscas el archivo </w:t>
+      </w:r>
+      <w:r>
+        <w:rPr>
+          <w:rFonts w:ascii="Consolas" w:hAnsi="Consolas" w:eastAsia="Consolas"/>
+          <w:b w:val="0"/>
+          <w:i w:val="0"/>
+          <w:color w:val="0A2342"/>
+          <w:sz w:val="21"/>
+        </w:rPr>
+        <w:t>login_screen.py</w:t>
+      </w:r>
+      <w:r>
+        <w:rPr>
+          <w:rFonts w:ascii="Calibri" w:hAnsi="Calibri" w:eastAsia="Calibri"/>
+          <w:b w:val="0"/>
+          <w:i w:val="0"/>
+        </w:rPr>
+        <w:t xml:space="preserve"> dentro</w:t>
+      </w:r>
+    </w:p>
+    <w:p>
+      <w:r>
+        <w:rPr>
+          <w:rFonts w:ascii="Calibri" w:hAnsi="Calibri" w:eastAsia="Calibri"/>
+          <w:b w:val="0"/>
+          <w:i w:val="0"/>
+        </w:rPr>
+        <w:t xml:space="preserve">de la carpeta </w:t>
+      </w:r>
+      <w:r>
+        <w:rPr>
+          <w:rFonts w:ascii="Consolas" w:hAnsi="Consolas" w:eastAsia="Consolas"/>
+          <w:b w:val="0"/>
+          <w:i w:val="0"/>
+          <w:color w:val="0A2342"/>
+          <w:sz w:val="21"/>
+        </w:rPr>
+        <w:t>screens</w:t>
+      </w:r>
+      <w:r>
+        <w:rPr>
+          <w:rFonts w:ascii="Calibri" w:hAnsi="Calibri" w:eastAsia="Calibri"/>
+          <w:b w:val="0"/>
+          <w:i w:val="0"/>
+        </w:rPr>
+        <w:t>.</w:t>
+      </w:r>
+    </w:p>
+    <w:p>
+      <w:pPr>
+        <w:spacing w:before="80" w:after="160"/>
+        <w:ind w:left="432"/>
+        <w:shd w:val="clear" w:color="auto" w:fill="EAF3EE"/>
+      </w:pPr>
+      <w:r>
+        <w:rPr>
+          <w:rFonts w:ascii="Calibri" w:hAnsi="Calibri" w:eastAsia="Calibri"/>
+          <w:b w:val="0"/>
+          <w:i/>
+          <w:color w:val="0A4D2E"/>
+        </w:rPr>
+        <w:t xml:space="preserve">💡 </w:t>
+      </w:r>
+      <w:r>
+        <w:rPr>
+          <w:rFonts w:ascii="Calibri" w:hAnsi="Calibri" w:eastAsia="Calibri"/>
+          <w:b/>
+          <w:i/>
+          <w:color w:val="0A4D2E"/>
+        </w:rPr>
+        <w:t>Ejercicio para estudiar:</w:t>
+      </w:r>
+      <w:r>
+        <w:rPr>
+          <w:rFonts w:ascii="Calibri" w:hAnsi="Calibri" w:eastAsia="Calibri"/>
+          <w:b w:val="0"/>
+          <w:i/>
+          <w:color w:val="0A4D2E"/>
+        </w:rPr>
+        <w:t xml:space="preserve"> abre la app, navega hasta la pantalla de la captura y</w:t>
+      </w:r>
+    </w:p>
+    <w:p>
+      <w:pPr>
+        <w:spacing w:before="80" w:after="160"/>
+        <w:ind w:left="432"/>
+        <w:shd w:val="clear" w:color="auto" w:fill="EAF3EE"/>
+      </w:pPr>
+      <w:r>
+        <w:rPr>
+          <w:rFonts w:ascii="Calibri" w:hAnsi="Calibri" w:eastAsia="Calibri"/>
+          <w:b w:val="0"/>
+          <w:i/>
+          <w:color w:val="0A4D2E"/>
+        </w:rPr>
+        <w:t>luego abre su archivo de código. Compáralo con lo explicado en las secciones 4.4 a 4.12.</w:t>
+      </w:r>
+    </w:p>
+    <w:p>
+      <w:pPr>
+        <w:spacing w:before="80" w:after="160"/>
+        <w:ind w:left="432"/>
+        <w:shd w:val="clear" w:color="auto" w:fill="EAF3EE"/>
+      </w:pPr>
+      <w:r>
+        <w:rPr>
+          <w:rFonts w:ascii="Calibri" w:hAnsi="Calibri" w:eastAsia="Calibri"/>
+          <w:b w:val="0"/>
+          <w:i/>
+          <w:color w:val="0A4D2E"/>
+        </w:rPr>
+        <w:t>La pantalla real y el código van de la mano.</w:t>
       </w:r>
     </w:p>
     <w:p>
@@ -17837,6 +19086,1594 @@
           <w:i w:val="0"/>
         </w:rPr>
         <w:t>¿Por qué la Fase 2 del historial tuvo "fixes" de colores y fuentes?</w:t>
+      </w:r>
+    </w:p>
+    <w:p>
+      <w:pPr>
+        <w:pBdr>
+          <w:bottom w:val="single" w:sz="6" w:space="1" w:color="0A2342"/>
+        </w:pBdr>
+      </w:pPr>
+    </w:p>
+    <w:p>
+      <w:pPr>
+        <w:spacing w:before="320" w:after="120"/>
+      </w:pPr>
+      <w:r>
+        <w:rPr>
+          <w:rFonts w:ascii="Calibri" w:hAnsi="Calibri" w:eastAsia="Calibri"/>
+          <w:b/>
+          <w:color w:val="0A4D2E"/>
+          <w:sz w:val="32"/>
+        </w:rPr>
+        <w:t>10. Mini-tutorial de Git (para los 6 integrantes)</w:t>
+      </w:r>
+    </w:p>
+    <w:p>
+      <w:r>
+        <w:rPr>
+          <w:rFonts w:ascii="Calibri" w:hAnsi="Calibri" w:eastAsia="Calibri"/>
+          <w:b w:val="0"/>
+          <w:i w:val="0"/>
+        </w:rPr>
+        <w:t xml:space="preserve">Git es la herramienta que </w:t>
+      </w:r>
+      <w:r>
+        <w:rPr>
+          <w:rFonts w:ascii="Calibri" w:hAnsi="Calibri" w:eastAsia="Calibri"/>
+          <w:b/>
+          <w:i w:val="0"/>
+        </w:rPr>
+        <w:t>lleva el diario de cambios</w:t>
+      </w:r>
+      <w:r>
+        <w:rPr>
+          <w:rFonts w:ascii="Calibri" w:hAnsi="Calibri" w:eastAsia="Calibri"/>
+          <w:b w:val="0"/>
+          <w:i w:val="0"/>
+        </w:rPr>
+        <w:t xml:space="preserve"> del proyecto. GitHub es la</w:t>
+      </w:r>
+    </w:p>
+    <w:p>
+      <w:r>
+        <w:rPr>
+          <w:rFonts w:ascii="Calibri" w:hAnsi="Calibri" w:eastAsia="Calibri"/>
+          <w:b/>
+          <w:i w:val="0"/>
+        </w:rPr>
+        <w:t>"nube"</w:t>
+      </w:r>
+      <w:r>
+        <w:rPr>
+          <w:rFonts w:ascii="Calibri" w:hAnsi="Calibri" w:eastAsia="Calibri"/>
+          <w:b w:val="0"/>
+          <w:i w:val="0"/>
+        </w:rPr>
+        <w:t xml:space="preserve"> donde está guardado ese proyecto en internet para que todos puedan verlo y</w:t>
+      </w:r>
+    </w:p>
+    <w:p>
+      <w:r>
+        <w:rPr>
+          <w:rFonts w:ascii="Calibri" w:hAnsi="Calibri" w:eastAsia="Calibri"/>
+          <w:b w:val="0"/>
+          <w:i w:val="0"/>
+        </w:rPr>
+        <w:t>trabajar juntos.</w:t>
+      </w:r>
+    </w:p>
+    <w:p>
+      <w:pPr>
+        <w:spacing w:before="80" w:after="160"/>
+        <w:ind w:left="432"/>
+        <w:shd w:val="clear" w:color="auto" w:fill="EAF3EE"/>
+      </w:pPr>
+      <w:r>
+        <w:rPr>
+          <w:rFonts w:ascii="Calibri" w:hAnsi="Calibri" w:eastAsia="Calibri"/>
+          <w:b/>
+          <w:i/>
+          <w:color w:val="0A4D2E"/>
+        </w:rPr>
+        <w:t>Idea clave:</w:t>
+      </w:r>
+      <w:r>
+        <w:rPr>
+          <w:rFonts w:ascii="Calibri" w:hAnsi="Calibri" w:eastAsia="Calibri"/>
+          <w:b w:val="0"/>
+          <w:i/>
+          <w:color w:val="0A4D2E"/>
+        </w:rPr>
+        <w:t xml:space="preserve"> "subir los cambios" se llama </w:t>
+      </w:r>
+      <w:r>
+        <w:rPr>
+          <w:rFonts w:ascii="Calibri" w:hAnsi="Calibri" w:eastAsia="Calibri"/>
+          <w:b w:val="0"/>
+          <w:i/>
+          <w:color w:val="0A4D2E"/>
+        </w:rPr>
+        <w:t>hacer push</w:t>
+      </w:r>
+      <w:r>
+        <w:rPr>
+          <w:rFonts w:ascii="Calibri" w:hAnsi="Calibri" w:eastAsia="Calibri"/>
+          <w:b w:val="0"/>
+          <w:i/>
+          <w:color w:val="0A4D2E"/>
+        </w:rPr>
+        <w:t xml:space="preserve"> y "traer los cambios de los</w:t>
+      </w:r>
+    </w:p>
+    <w:p>
+      <w:pPr>
+        <w:spacing w:before="80" w:after="160"/>
+        <w:ind w:left="432"/>
+        <w:shd w:val="clear" w:color="auto" w:fill="EAF3EE"/>
+      </w:pPr>
+      <w:r>
+        <w:rPr>
+          <w:rFonts w:ascii="Calibri" w:hAnsi="Calibri" w:eastAsia="Calibri"/>
+          <w:b w:val="0"/>
+          <w:i/>
+          <w:color w:val="0A4D2E"/>
+        </w:rPr>
+        <w:t xml:space="preserve">demás" se llama </w:t>
+      </w:r>
+      <w:r>
+        <w:rPr>
+          <w:rFonts w:ascii="Calibri" w:hAnsi="Calibri" w:eastAsia="Calibri"/>
+          <w:b w:val="0"/>
+          <w:i/>
+          <w:color w:val="0A4D2E"/>
+        </w:rPr>
+        <w:t>hacer pull</w:t>
+      </w:r>
+      <w:r>
+        <w:rPr>
+          <w:rFonts w:ascii="Calibri" w:hAnsi="Calibri" w:eastAsia="Calibri"/>
+          <w:b w:val="0"/>
+          <w:i/>
+          <w:color w:val="0A4D2E"/>
+        </w:rPr>
+        <w:t>. Con solo entender esas dos palabras + el commit, ya</w:t>
+      </w:r>
+    </w:p>
+    <w:p>
+      <w:pPr>
+        <w:spacing w:before="80" w:after="160"/>
+        <w:ind w:left="432"/>
+        <w:shd w:val="clear" w:color="auto" w:fill="EAF3EE"/>
+      </w:pPr>
+      <w:r>
+        <w:rPr>
+          <w:rFonts w:ascii="Calibri" w:hAnsi="Calibri" w:eastAsia="Calibri"/>
+          <w:b w:val="0"/>
+          <w:i/>
+          <w:color w:val="0A4D2E"/>
+        </w:rPr>
+        <w:t>tienes lo esencial.</w:t>
+      </w:r>
+    </w:p>
+    <w:p>
+      <w:pPr>
+        <w:spacing w:before="240"/>
+      </w:pPr>
+      <w:r>
+        <w:rPr>
+          <w:rFonts w:ascii="Calibri" w:hAnsi="Calibri" w:eastAsia="Calibri"/>
+          <w:b/>
+          <w:color w:val="1565C0"/>
+          <w:sz w:val="26"/>
+        </w:rPr>
+        <w:t>10.1 El repositorio (nuestra página en GitHub)</w:t>
+      </w:r>
+    </w:p>
+    <w:p>
+      <w:r>
+        <w:rPr>
+          <w:rFonts w:ascii="Calibri" w:hAnsi="Calibri" w:eastAsia="Calibri"/>
+          <w:b w:val="0"/>
+          <w:i w:val="0"/>
+        </w:rPr>
+        <w:t>El proyecto vive en esta dirección (es público, todos pueden verlo aunque no tengan</w:t>
+      </w:r>
+    </w:p>
+    <w:p>
+      <w:r>
+        <w:rPr>
+          <w:rFonts w:ascii="Calibri" w:hAnsi="Calibri" w:eastAsia="Calibri"/>
+          <w:b w:val="0"/>
+          <w:i w:val="0"/>
+        </w:rPr>
+        <w:t>cuenta):</w:t>
+      </w:r>
+    </w:p>
+    <w:p>
+      <w:pPr>
+        <w:spacing w:after="0"/>
+        <w:ind w:left="360"/>
+        <w:shd w:val="clear" w:color="auto" w:fill="F2F5F9"/>
+      </w:pPr>
+      <w:r>
+        <w:rPr>
+          <w:rFonts w:ascii="Consolas" w:hAnsi="Consolas" w:eastAsia="Consolas"/>
+          <w:color w:val="444444"/>
+          <w:sz w:val="19"/>
+        </w:rPr>
+        <w:t>https://github.com/chrissaraviagomez-lab/salunic-app</w:t>
+      </w:r>
+    </w:p>
+    <w:p>
+      <w:r>
+        <w:rPr>
+          <w:rFonts w:ascii="Calibri" w:hAnsi="Calibri" w:eastAsia="Calibri"/>
+          <w:b w:val="0"/>
+          <w:i w:val="0"/>
+        </w:rPr>
+        <w:t xml:space="preserve">Ahí encuentras: los archivos del proyecto, el </w:t>
+      </w:r>
+      <w:r>
+        <w:rPr>
+          <w:rFonts w:ascii="Calibri" w:hAnsi="Calibri" w:eastAsia="Calibri"/>
+          <w:b/>
+          <w:i w:val="0"/>
+        </w:rPr>
+        <w:t>Documento Explicativo del Código</w:t>
+      </w:r>
+      <w:r>
+        <w:rPr>
+          <w:rFonts w:ascii="Calibri" w:hAnsi="Calibri" w:eastAsia="Calibri"/>
+          <w:b w:val="0"/>
+          <w:i w:val="0"/>
+        </w:rPr>
+        <w:t xml:space="preserve"> (este</w:t>
+      </w:r>
+    </w:p>
+    <w:p>
+      <w:r>
+        <w:rPr>
+          <w:rFonts w:ascii="Calibri" w:hAnsi="Calibri" w:eastAsia="Calibri"/>
+          <w:b w:val="0"/>
+          <w:i w:val="0"/>
+        </w:rPr>
+        <w:t xml:space="preserve">documento), la carpeta de documentos del II semestre, y el </w:t>
+      </w:r>
+      <w:r>
+        <w:rPr>
+          <w:rFonts w:ascii="Calibri" w:hAnsi="Calibri" w:eastAsia="Calibri"/>
+          <w:b/>
+          <w:i w:val="0"/>
+        </w:rPr>
+        <w:t>historial de commits</w:t>
+      </w:r>
+    </w:p>
+    <w:p>
+      <w:r>
+        <w:rPr>
+          <w:rFonts w:ascii="Calibri" w:hAnsi="Calibri" w:eastAsia="Calibri"/>
+          <w:b w:val="0"/>
+          <w:i w:val="0"/>
+        </w:rPr>
+        <w:t>(cada cambio con su fecha y su mensaje).</w:t>
+      </w:r>
+    </w:p>
+    <w:p>
+      <w:pPr>
+        <w:spacing w:before="240"/>
+      </w:pPr>
+      <w:r>
+        <w:rPr>
+          <w:rFonts w:ascii="Calibri" w:hAnsi="Calibri" w:eastAsia="Calibri"/>
+          <w:b/>
+          <w:color w:val="1565C0"/>
+          <w:sz w:val="26"/>
+        </w:rPr>
+        <w:t>10.2 Cómo ver el documento explicativo desde GitHub (sin instalar nada)</w:t>
+      </w:r>
+    </w:p>
+    <w:p>
+      <w:pPr>
+        <w:pStyle w:val="ListNumber"/>
+        <w:spacing w:after="60"/>
+      </w:pPr>
+      <w:r>
+        <w:rPr>
+          <w:rFonts w:ascii="Calibri" w:hAnsi="Calibri" w:eastAsia="Calibri"/>
+          <w:b w:val="0"/>
+          <w:i w:val="0"/>
+        </w:rPr>
+        <w:t xml:space="preserve">Entra a: </w:t>
+      </w:r>
+      <w:r>
+        <w:rPr>
+          <w:rFonts w:ascii="Consolas" w:hAnsi="Consolas" w:eastAsia="Consolas"/>
+          <w:b w:val="0"/>
+          <w:i w:val="0"/>
+          <w:color w:val="0A2342"/>
+          <w:sz w:val="21"/>
+        </w:rPr>
+        <w:t>https://github.com/chrissaraviagomez-lab/salunic-app</w:t>
+      </w:r>
+    </w:p>
+    <w:p>
+      <w:pPr>
+        <w:pStyle w:val="ListNumber"/>
+        <w:spacing w:after="60"/>
+      </w:pPr>
+      <w:r>
+        <w:rPr>
+          <w:rFonts w:ascii="Calibri" w:hAnsi="Calibri" w:eastAsia="Calibri"/>
+          <w:b w:val="0"/>
+          <w:i w:val="0"/>
+        </w:rPr>
+        <w:t xml:space="preserve">En la lista de archivos, dale clic a </w:t>
+      </w:r>
+      <w:r>
+        <w:rPr>
+          <w:rFonts w:ascii="Calibri" w:hAnsi="Calibri" w:eastAsia="Calibri"/>
+          <w:b/>
+          <w:i w:val="0"/>
+        </w:rPr>
+        <w:t>`Documento Explicativo del Código.md`</w:t>
+      </w:r>
+      <w:r>
+        <w:rPr>
+          <w:rFonts w:ascii="Calibri" w:hAnsi="Calibri" w:eastAsia="Calibri"/>
+          <w:b w:val="0"/>
+          <w:i w:val="0"/>
+        </w:rPr>
+        <w:t>.</w:t>
+      </w:r>
+    </w:p>
+    <w:p>
+      <w:r>
+        <w:rPr>
+          <w:rFonts w:ascii="Calibri" w:hAnsi="Calibri" w:eastAsia="Calibri"/>
+          <w:b w:val="0"/>
+          <w:i w:val="0"/>
+        </w:rPr>
+        <w:t xml:space="preserve">   GitHub lo abre con formato bonito (títulos, tablas, código y capturas).</w:t>
+      </w:r>
+    </w:p>
+    <w:p>
+      <w:pPr>
+        <w:pStyle w:val="ListNumber"/>
+        <w:spacing w:after="60"/>
+      </w:pPr>
+      <w:r>
+        <w:rPr>
+          <w:rFonts w:ascii="Calibri" w:hAnsi="Calibri" w:eastAsia="Calibri"/>
+          <w:b w:val="0"/>
+          <w:i w:val="0"/>
+        </w:rPr>
+        <w:t>Si quieres el archivo directo (para bajar el .docx o el PDF), dale clic al archivo</w:t>
+      </w:r>
+    </w:p>
+    <w:p>
+      <w:r>
+        <w:rPr>
+          <w:rFonts w:ascii="Calibri" w:hAnsi="Calibri" w:eastAsia="Calibri"/>
+          <w:b w:val="0"/>
+          <w:i w:val="0"/>
+        </w:rPr>
+        <w:t xml:space="preserve">   y luego al botón </w:t>
+      </w:r>
+      <w:r>
+        <w:rPr>
+          <w:rFonts w:ascii="Calibri" w:hAnsi="Calibri" w:eastAsia="Calibri"/>
+          <w:b/>
+          <w:i w:val="0"/>
+        </w:rPr>
+        <w:t>`Download`</w:t>
+      </w:r>
+      <w:r>
+        <w:rPr>
+          <w:rFonts w:ascii="Calibri" w:hAnsi="Calibri" w:eastAsia="Calibri"/>
+          <w:b w:val="0"/>
+          <w:i w:val="0"/>
+        </w:rPr>
+        <w:t xml:space="preserve"> o </w:t>
+      </w:r>
+      <w:r>
+        <w:rPr>
+          <w:rFonts w:ascii="Calibri" w:hAnsi="Calibri" w:eastAsia="Calibri"/>
+          <w:b/>
+          <w:i w:val="0"/>
+        </w:rPr>
+        <w:t>`Raw`</w:t>
+      </w:r>
+      <w:r>
+        <w:rPr>
+          <w:rFonts w:ascii="Calibri" w:hAnsi="Calibri" w:eastAsia="Calibri"/>
+          <w:b w:val="0"/>
+          <w:i w:val="0"/>
+        </w:rPr>
+        <w:t>.</w:t>
+      </w:r>
+    </w:p>
+    <w:p>
+      <w:pPr>
+        <w:spacing w:before="80" w:after="160"/>
+        <w:ind w:left="432"/>
+        <w:shd w:val="clear" w:color="auto" w:fill="EAF3EE"/>
+      </w:pPr>
+      <w:r>
+        <w:rPr>
+          <w:rFonts w:ascii="Calibri" w:hAnsi="Calibri" w:eastAsia="Calibri"/>
+          <w:b/>
+          <w:i/>
+          <w:color w:val="0A4D2E"/>
+        </w:rPr>
+        <w:t>Consejo:</w:t>
+      </w:r>
+      <w:r>
+        <w:rPr>
+          <w:rFonts w:ascii="Calibri" w:hAnsi="Calibri" w:eastAsia="Calibri"/>
+          <w:b w:val="0"/>
+          <w:i/>
+          <w:color w:val="0A4D2E"/>
+        </w:rPr>
+        <w:t xml:space="preserve"> para leer este documento en tu celular también funciona 📱 — el formato</w:t>
+      </w:r>
+    </w:p>
+    <w:p>
+      <w:pPr>
+        <w:spacing w:before="80" w:after="160"/>
+        <w:ind w:left="432"/>
+        <w:shd w:val="clear" w:color="auto" w:fill="EAF3EE"/>
+      </w:pPr>
+      <w:r>
+        <w:rPr>
+          <w:rFonts w:ascii="Calibri" w:hAnsi="Calibri" w:eastAsia="Calibri"/>
+          <w:b w:val="0"/>
+          <w:i/>
+          <w:color w:val="0A4D2E"/>
+        </w:rPr>
+        <w:t>se adapta solo.</w:t>
+      </w:r>
+    </w:p>
+    <w:p>
+      <w:pPr>
+        <w:spacing w:before="240"/>
+      </w:pPr>
+      <w:r>
+        <w:rPr>
+          <w:rFonts w:ascii="Calibri" w:hAnsi="Calibri" w:eastAsia="Calibri"/>
+          <w:b/>
+          <w:color w:val="1565C0"/>
+          <w:sz w:val="26"/>
+        </w:rPr>
+        <w:t>10.3 Descargar todo el proyecto (la forma más fácil)</w:t>
+      </w:r>
+    </w:p>
+    <w:p>
+      <w:r>
+        <w:rPr>
+          <w:rFonts w:ascii="Calibri" w:hAnsi="Calibri" w:eastAsia="Calibri"/>
+          <w:b w:val="0"/>
+          <w:i w:val="0"/>
+        </w:rPr>
+        <w:t>Sin instalar nada, baja el proyecto como una carpeta comprimida:</w:t>
+      </w:r>
+    </w:p>
+    <w:p>
+      <w:pPr>
+        <w:pStyle w:val="ListNumber"/>
+        <w:spacing w:after="60"/>
+      </w:pPr>
+      <w:r>
+        <w:rPr>
+          <w:rFonts w:ascii="Calibri" w:hAnsi="Calibri" w:eastAsia="Calibri"/>
+          <w:b w:val="0"/>
+          <w:i w:val="0"/>
+        </w:rPr>
+        <w:t xml:space="preserve">Abre </w:t>
+      </w:r>
+      <w:r>
+        <w:rPr>
+          <w:rFonts w:ascii="Consolas" w:hAnsi="Consolas" w:eastAsia="Consolas"/>
+          <w:b w:val="0"/>
+          <w:i w:val="0"/>
+          <w:color w:val="0A2342"/>
+          <w:sz w:val="21"/>
+        </w:rPr>
+        <w:t>https://github.com/chrissaraviagomez-lab/salunic-app</w:t>
+      </w:r>
+    </w:p>
+    <w:p>
+      <w:pPr>
+        <w:pStyle w:val="ListNumber"/>
+        <w:spacing w:after="60"/>
+      </w:pPr>
+      <w:r>
+        <w:rPr>
+          <w:rFonts w:ascii="Calibri" w:hAnsi="Calibri" w:eastAsia="Calibri"/>
+          <w:b w:val="0"/>
+          <w:i w:val="0"/>
+        </w:rPr>
+        <w:t xml:space="preserve">Clic en el botón verde </w:t>
+      </w:r>
+      <w:r>
+        <w:rPr>
+          <w:rFonts w:ascii="Calibri" w:hAnsi="Calibri" w:eastAsia="Calibri"/>
+          <w:b/>
+          <w:i w:val="0"/>
+        </w:rPr>
+        <w:t>`Code`</w:t>
+      </w:r>
+      <w:r>
+        <w:rPr>
+          <w:rFonts w:ascii="Calibri" w:hAnsi="Calibri" w:eastAsia="Calibri"/>
+          <w:b w:val="0"/>
+          <w:i w:val="0"/>
+        </w:rPr>
+        <w:t xml:space="preserve"> (arriba a la derecha).</w:t>
+      </w:r>
+    </w:p>
+    <w:p>
+      <w:pPr>
+        <w:pStyle w:val="ListNumber"/>
+        <w:spacing w:after="60"/>
+      </w:pPr>
+      <w:r>
+        <w:rPr>
+          <w:rFonts w:ascii="Calibri" w:hAnsi="Calibri" w:eastAsia="Calibri"/>
+          <w:b w:val="0"/>
+          <w:i w:val="0"/>
+        </w:rPr>
+        <w:t xml:space="preserve">Clic en </w:t>
+      </w:r>
+      <w:r>
+        <w:rPr>
+          <w:rFonts w:ascii="Calibri" w:hAnsi="Calibri" w:eastAsia="Calibri"/>
+          <w:b/>
+          <w:i w:val="0"/>
+        </w:rPr>
+        <w:t>`Download ZIP`</w:t>
+      </w:r>
+      <w:r>
+        <w:rPr>
+          <w:rFonts w:ascii="Calibri" w:hAnsi="Calibri" w:eastAsia="Calibri"/>
+          <w:b w:val="0"/>
+          <w:i w:val="0"/>
+        </w:rPr>
+        <w:t>.</w:t>
+      </w:r>
+    </w:p>
+    <w:p>
+      <w:pPr>
+        <w:pStyle w:val="ListNumber"/>
+        <w:spacing w:after="60"/>
+      </w:pPr>
+      <w:r>
+        <w:rPr>
+          <w:rFonts w:ascii="Calibri" w:hAnsi="Calibri" w:eastAsia="Calibri"/>
+          <w:b w:val="0"/>
+          <w:i w:val="0"/>
+        </w:rPr>
+        <w:t>Descomprime el archivo donde quieras (ej: en tu carpeta de Documentos).</w:t>
+      </w:r>
+    </w:p>
+    <w:p>
+      <w:r>
+        <w:rPr>
+          <w:rFonts w:ascii="Calibri" w:hAnsi="Calibri" w:eastAsia="Calibri"/>
+          <w:b w:val="0"/>
+          <w:i w:val="0"/>
+        </w:rPr>
+        <w:t xml:space="preserve">Para </w:t>
+      </w:r>
+      <w:r>
+        <w:rPr>
+          <w:rFonts w:ascii="Calibri" w:hAnsi="Calibri" w:eastAsia="Calibri"/>
+          <w:b/>
+          <w:i w:val="0"/>
+        </w:rPr>
+        <w:t>ejecutar la app</w:t>
+      </w:r>
+      <w:r>
+        <w:rPr>
+          <w:rFonts w:ascii="Calibri" w:hAnsi="Calibri" w:eastAsia="Calibri"/>
+          <w:b w:val="0"/>
+          <w:i w:val="0"/>
+        </w:rPr>
+        <w:t xml:space="preserve"> después de bajar el ZIP, abre una terminal dentro de la carpeta</w:t>
+      </w:r>
+    </w:p>
+    <w:p>
+      <w:r>
+        <w:rPr>
+          <w:rFonts w:ascii="Calibri" w:hAnsi="Calibri" w:eastAsia="Calibri"/>
+          <w:b w:val="0"/>
+          <w:i w:val="0"/>
+        </w:rPr>
+        <w:t xml:space="preserve">descomprimida y escribe </w:t>
+      </w:r>
+      <w:r>
+        <w:rPr>
+          <w:rFonts w:ascii="Consolas" w:hAnsi="Consolas" w:eastAsia="Consolas"/>
+          <w:b w:val="0"/>
+          <w:i w:val="0"/>
+          <w:color w:val="0A2342"/>
+          <w:sz w:val="21"/>
+        </w:rPr>
+        <w:t>py main.py</w:t>
+      </w:r>
+      <w:r>
+        <w:rPr>
+          <w:rFonts w:ascii="Calibri" w:hAnsi="Calibri" w:eastAsia="Calibri"/>
+          <w:b w:val="0"/>
+          <w:i w:val="0"/>
+        </w:rPr>
+        <w:t>. (Necesitas Python instalado; el ZIP ya trae todo</w:t>
+      </w:r>
+    </w:p>
+    <w:p>
+      <w:r>
+        <w:rPr>
+          <w:rFonts w:ascii="Calibri" w:hAnsi="Calibri" w:eastAsia="Calibri"/>
+          <w:b w:val="0"/>
+          <w:i w:val="0"/>
+        </w:rPr>
+        <w:t>el código.)</w:t>
+      </w:r>
+    </w:p>
+    <w:p>
+      <w:pPr>
+        <w:spacing w:before="240"/>
+      </w:pPr>
+      <w:r>
+        <w:rPr>
+          <w:rFonts w:ascii="Calibri" w:hAnsi="Calibri" w:eastAsia="Calibri"/>
+          <w:b/>
+          <w:color w:val="1565C0"/>
+          <w:sz w:val="26"/>
+        </w:rPr>
+        <w:t>10.4 Instalar Git (si quieres trabajar con los comandos)</w:t>
+      </w:r>
+    </w:p>
+    <w:p>
+      <w:r>
+        <w:rPr>
+          <w:rFonts w:ascii="Calibri" w:hAnsi="Calibri" w:eastAsia="Calibri"/>
+          <w:b w:val="0"/>
+          <w:i w:val="0"/>
+        </w:rPr>
+        <w:t xml:space="preserve">La forma </w:t>
+      </w:r>
+      <w:r>
+        <w:rPr>
+          <w:rFonts w:ascii="Calibri" w:hAnsi="Calibri" w:eastAsia="Calibri"/>
+          <w:b w:val="0"/>
+          <w:i/>
+        </w:rPr>
+        <w:t>de programador</w:t>
+      </w:r>
+      <w:r>
+        <w:rPr>
+          <w:rFonts w:ascii="Calibri" w:hAnsi="Calibri" w:eastAsia="Calibri"/>
+          <w:b w:val="0"/>
+          <w:i w:val="0"/>
+        </w:rPr>
+        <w:t xml:space="preserve"> es instalar Git y clonar el proyecto. Con Git cada integrante</w:t>
+      </w:r>
+    </w:p>
+    <w:p>
+      <w:r>
+        <w:rPr>
+          <w:rFonts w:ascii="Calibri" w:hAnsi="Calibri" w:eastAsia="Calibri"/>
+          <w:b w:val="0"/>
+          <w:i w:val="0"/>
+        </w:rPr>
+        <w:t>puede actualizarlo sin volver a bajar el ZIP:</w:t>
+      </w:r>
+    </w:p>
+    <w:p>
+      <w:pPr>
+        <w:pStyle w:val="ListNumber"/>
+        <w:spacing w:after="60"/>
+      </w:pPr>
+      <w:r>
+        <w:rPr>
+          <w:rFonts w:ascii="Calibri" w:hAnsi="Calibri" w:eastAsia="Calibri"/>
+          <w:b w:val="0"/>
+          <w:i w:val="0"/>
+        </w:rPr>
+        <w:t xml:space="preserve">Descarga e instala Git desde: </w:t>
+      </w:r>
+      <w:r>
+        <w:rPr>
+          <w:rFonts w:ascii="Consolas" w:hAnsi="Consolas" w:eastAsia="Consolas"/>
+          <w:b w:val="0"/>
+          <w:i w:val="0"/>
+          <w:color w:val="0A2342"/>
+          <w:sz w:val="21"/>
+        </w:rPr>
+        <w:t>https://git-scm.com/download/win</w:t>
+      </w:r>
+    </w:p>
+    <w:p>
+      <w:r>
+        <w:rPr>
+          <w:rFonts w:ascii="Calibri" w:hAnsi="Calibri" w:eastAsia="Calibri"/>
+          <w:b w:val="0"/>
+          <w:i w:val="0"/>
+        </w:rPr>
+        <w:t xml:space="preserve">   (siguiente → siguiente → instalar, con las opciones por defecto).</w:t>
+      </w:r>
+    </w:p>
+    <w:p>
+      <w:pPr>
+        <w:pStyle w:val="ListNumber"/>
+        <w:spacing w:after="60"/>
+      </w:pPr>
+      <w:r>
+        <w:rPr>
+          <w:rFonts w:ascii="Calibri" w:hAnsi="Calibri" w:eastAsia="Calibri"/>
+          <w:b w:val="0"/>
+          <w:i w:val="0"/>
+        </w:rPr>
+        <w:t>Abre la terminal (CMD o PowerShell) y escribe:</w:t>
+      </w:r>
+    </w:p>
+    <w:p>
+      <w:pPr>
+        <w:spacing w:after="0"/>
+        <w:ind w:left="360"/>
+        <w:shd w:val="clear" w:color="auto" w:fill="F2F5F9"/>
+      </w:pPr>
+      <w:r>
+        <w:rPr>
+          <w:rFonts w:ascii="Consolas" w:hAnsi="Consolas" w:eastAsia="Consolas"/>
+          <w:color w:val="444444"/>
+          <w:sz w:val="19"/>
+        </w:rPr>
+        <w:t>git clone https://github.com/chrissaraviagomez-lab/salunic-app.git</w:t>
+      </w:r>
+    </w:p>
+    <w:p>
+      <w:r>
+        <w:rPr>
+          <w:rFonts w:ascii="Calibri" w:hAnsi="Calibri" w:eastAsia="Calibri"/>
+          <w:b w:val="0"/>
+          <w:i w:val="0"/>
+        </w:rPr>
+        <w:t xml:space="preserve">Aparecerá una carpeta llamada </w:t>
+      </w:r>
+      <w:r>
+        <w:rPr>
+          <w:rFonts w:ascii="Consolas" w:hAnsi="Consolas" w:eastAsia="Consolas"/>
+          <w:b w:val="0"/>
+          <w:i w:val="0"/>
+          <w:color w:val="0A2342"/>
+          <w:sz w:val="21"/>
+        </w:rPr>
+        <w:t>salunic-app</w:t>
+      </w:r>
+      <w:r>
+        <w:rPr>
+          <w:rFonts w:ascii="Calibri" w:hAnsi="Calibri" w:eastAsia="Calibri"/>
+          <w:b w:val="0"/>
+          <w:i w:val="0"/>
+        </w:rPr>
+        <w:t xml:space="preserve"> con todo el proyecto. Eso se llama</w:t>
+      </w:r>
+    </w:p>
+    <w:p>
+      <w:r>
+        <w:rPr>
+          <w:rFonts w:ascii="Calibri" w:hAnsi="Calibri" w:eastAsia="Calibri"/>
+          <w:b/>
+          <w:i w:val="0"/>
+        </w:rPr>
+        <w:t>clonar</w:t>
+      </w:r>
+      <w:r>
+        <w:rPr>
+          <w:rFonts w:ascii="Calibri" w:hAnsi="Calibri" w:eastAsia="Calibri"/>
+          <w:b w:val="0"/>
+          <w:i w:val="0"/>
+        </w:rPr>
+        <w:t xml:space="preserve"> (descargar una copia completa que se puede sincronizar).</w:t>
+      </w:r>
+    </w:p>
+    <w:p>
+      <w:pPr>
+        <w:spacing w:before="240"/>
+      </w:pPr>
+      <w:r>
+        <w:rPr>
+          <w:rFonts w:ascii="Calibri" w:hAnsi="Calibri" w:eastAsia="Calibri"/>
+          <w:b/>
+          <w:color w:val="1565C0"/>
+          <w:sz w:val="26"/>
+        </w:rPr>
+        <w:t>10.5 Los 5 comandos que todos debemos conocer</w:t>
+      </w:r>
+    </w:p>
+    <w:tbl>
+      <w:tblPr>
+        <w:tblStyle w:val="LightGrid-Accent1"/>
+        <w:tblW w:type="auto" w:w="0"/>
+        <w:tblLook w:firstColumn="1" w:firstRow="1" w:lastColumn="0" w:lastRow="0" w:noHBand="0" w:noVBand="1" w:val="04A0"/>
+      </w:tblPr>
+      <w:tblGrid>
+        <w:gridCol w:w="2880"/>
+        <w:gridCol w:w="2880"/>
+        <w:gridCol w:w="2880"/>
+      </w:tblGrid>
+      <w:tr>
+        <w:tc>
+          <w:tcPr>
+            <w:tcW w:type="dxa" w:w="2880"/>
+          </w:tcPr>
+          <w:p>
+            <w:r/>
+            <w:r>
+              <w:rPr>
+                <w:b/>
+                <w:sz w:val="19"/>
+              </w:rPr>
+              <w:t>Comando</w:t>
+            </w:r>
+          </w:p>
+        </w:tc>
+        <w:tc>
+          <w:tcPr>
+            <w:tcW w:type="dxa" w:w="2880"/>
+          </w:tcPr>
+          <w:p>
+            <w:r/>
+            <w:r>
+              <w:rPr>
+                <w:b/>
+                <w:sz w:val="19"/>
+              </w:rPr>
+              <w:t>Qué hace</w:t>
+            </w:r>
+          </w:p>
+        </w:tc>
+        <w:tc>
+          <w:tcPr>
+            <w:tcW w:type="dxa" w:w="2880"/>
+          </w:tcPr>
+          <w:p>
+            <w:r/>
+            <w:r>
+              <w:rPr>
+                <w:b/>
+                <w:sz w:val="19"/>
+              </w:rPr>
+              <w:t>Cuándo lo uso</w:t>
+            </w:r>
+          </w:p>
+        </w:tc>
+      </w:tr>
+      <w:tr>
+        <w:tc>
+          <w:tcPr>
+            <w:tcW w:type="dxa" w:w="2880"/>
+          </w:tcPr>
+          <w:p>
+            <w:r/>
+            <w:r>
+              <w:rPr>
+                <w:sz w:val="19"/>
+              </w:rPr>
+              <w:t>git status</w:t>
+            </w:r>
+          </w:p>
+        </w:tc>
+        <w:tc>
+          <w:tcPr>
+            <w:tcW w:type="dxa" w:w="2880"/>
+          </w:tcPr>
+          <w:p>
+            <w:r/>
+            <w:r>
+              <w:rPr>
+                <w:sz w:val="19"/>
+              </w:rPr>
+              <w:t>Muestra qué archivos cambiaron y cuáles faltan por subir.</w:t>
+            </w:r>
+          </w:p>
+        </w:tc>
+        <w:tc>
+          <w:tcPr>
+            <w:tcW w:type="dxa" w:w="2880"/>
+          </w:tcPr>
+          <w:p>
+            <w:r/>
+            <w:r>
+              <w:rPr>
+                <w:sz w:val="19"/>
+              </w:rPr>
+              <w:t>Cuando quiero ver "qué hay pendiente".</w:t>
+            </w:r>
+          </w:p>
+        </w:tc>
+      </w:tr>
+      <w:tr>
+        <w:tc>
+          <w:tcPr>
+            <w:tcW w:type="dxa" w:w="2880"/>
+          </w:tcPr>
+          <w:p>
+            <w:r/>
+            <w:r>
+              <w:rPr>
+                <w:sz w:val="19"/>
+              </w:rPr>
+              <w:t>git add .</w:t>
+            </w:r>
+          </w:p>
+        </w:tc>
+        <w:tc>
+          <w:tcPr>
+            <w:tcW w:type="dxa" w:w="2880"/>
+          </w:tcPr>
+          <w:p>
+            <w:r/>
+            <w:r>
+              <w:rPr>
+                <w:sz w:val="19"/>
+              </w:rPr>
+              <w:t>"Marca" todos los cambios para guardarlos.</w:t>
+            </w:r>
+          </w:p>
+        </w:tc>
+        <w:tc>
+          <w:tcPr>
+            <w:tcW w:type="dxa" w:w="2880"/>
+          </w:tcPr>
+          <w:p>
+            <w:r/>
+            <w:r>
+              <w:rPr>
+                <w:sz w:val="19"/>
+              </w:rPr>
+              <w:t>Antes de hacer un commit.</w:t>
+            </w:r>
+          </w:p>
+        </w:tc>
+      </w:tr>
+      <w:tr>
+        <w:tc>
+          <w:tcPr>
+            <w:tcW w:type="dxa" w:w="2880"/>
+          </w:tcPr>
+          <w:p>
+            <w:r/>
+            <w:r>
+              <w:rPr>
+                <w:sz w:val="19"/>
+              </w:rPr>
+              <w:t>git commit -m "mensaje"</w:t>
+            </w:r>
+          </w:p>
+        </w:tc>
+        <w:tc>
+          <w:tcPr>
+            <w:tcW w:type="dxa" w:w="2880"/>
+          </w:tcPr>
+          <w:p>
+            <w:r/>
+            <w:r>
+              <w:rPr>
+                <w:sz w:val="19"/>
+              </w:rPr>
+              <w:t>Guarda una "foto" (commit) de los cambios con su descripción.</w:t>
+            </w:r>
+          </w:p>
+        </w:tc>
+        <w:tc>
+          <w:tcPr>
+            <w:tcW w:type="dxa" w:w="2880"/>
+          </w:tcPr>
+          <w:p>
+            <w:r/>
+            <w:r>
+              <w:rPr>
+                <w:sz w:val="19"/>
+              </w:rPr>
+              <w:t>Cuando terminé un cambio y quiero registrarlo.</w:t>
+            </w:r>
+          </w:p>
+        </w:tc>
+      </w:tr>
+      <w:tr>
+        <w:tc>
+          <w:tcPr>
+            <w:tcW w:type="dxa" w:w="2880"/>
+          </w:tcPr>
+          <w:p>
+            <w:r/>
+            <w:r>
+              <w:rPr>
+                <w:sz w:val="19"/>
+              </w:rPr>
+              <w:t>git push</w:t>
+            </w:r>
+          </w:p>
+        </w:tc>
+        <w:tc>
+          <w:tcPr>
+            <w:tcW w:type="dxa" w:w="2880"/>
+          </w:tcPr>
+          <w:p>
+            <w:r/>
+            <w:r>
+              <w:rPr>
+                <w:sz w:val="19"/>
+              </w:rPr>
+              <w:t>Sube los commits al GitHub (la nube).</w:t>
+            </w:r>
+          </w:p>
+        </w:tc>
+        <w:tc>
+          <w:tcPr>
+            <w:tcW w:type="dxa" w:w="2880"/>
+          </w:tcPr>
+          <w:p>
+            <w:r/>
+            <w:r>
+              <w:rPr>
+                <w:sz w:val="19"/>
+              </w:rPr>
+              <w:t>Para que los demás vean mis cambios.</w:t>
+            </w:r>
+          </w:p>
+        </w:tc>
+      </w:tr>
+      <w:tr>
+        <w:tc>
+          <w:tcPr>
+            <w:tcW w:type="dxa" w:w="2880"/>
+          </w:tcPr>
+          <w:p>
+            <w:r/>
+            <w:r>
+              <w:rPr>
+                <w:sz w:val="19"/>
+              </w:rPr>
+              <w:t>git pull</w:t>
+            </w:r>
+          </w:p>
+        </w:tc>
+        <w:tc>
+          <w:tcPr>
+            <w:tcW w:type="dxa" w:w="2880"/>
+          </w:tcPr>
+          <w:p>
+            <w:r/>
+            <w:r>
+              <w:rPr>
+                <w:sz w:val="19"/>
+              </w:rPr>
+              <w:t>Trae los cambios que otros subieron al GitHub.</w:t>
+            </w:r>
+          </w:p>
+        </w:tc>
+        <w:tc>
+          <w:tcPr>
+            <w:tcW w:type="dxa" w:w="2880"/>
+          </w:tcPr>
+          <w:p>
+            <w:r/>
+            <w:r>
+              <w:rPr>
+                <w:sz w:val="19"/>
+              </w:rPr>
+              <w:t>Antes de empezar a trabajar y siempre que alguien avise que subió algo.</w:t>
+            </w:r>
+          </w:p>
+        </w:tc>
+      </w:tr>
+    </w:tbl>
+    <w:p>
+      <w:r>
+        <w:rPr>
+          <w:rFonts w:ascii="Calibri" w:hAnsi="Calibri" w:eastAsia="Calibri"/>
+          <w:b w:val="0"/>
+          <w:i w:val="0"/>
+        </w:rPr>
+        <w:t>Ejemplo de un flujo completo de trabajo:</w:t>
+      </w:r>
+    </w:p>
+    <w:p>
+      <w:pPr>
+        <w:spacing w:after="0"/>
+        <w:ind w:left="360"/>
+        <w:shd w:val="clear" w:color="auto" w:fill="F2F5F9"/>
+      </w:pPr>
+      <w:r>
+        <w:rPr>
+          <w:rFonts w:ascii="Consolas" w:hAnsi="Consolas" w:eastAsia="Consolas"/>
+          <w:color w:val="444444"/>
+          <w:sz w:val="19"/>
+        </w:rPr>
+        <w:t>git pull                                # 1. traigo lo más reciente</w:t>
+      </w:r>
+    </w:p>
+    <w:p>
+      <w:pPr>
+        <w:spacing w:after="0"/>
+        <w:ind w:left="360"/>
+        <w:shd w:val="clear" w:color="auto" w:fill="F2F5F9"/>
+      </w:pPr>
+      <w:r>
+        <w:rPr>
+          <w:rFonts w:ascii="Consolas" w:hAnsi="Consolas" w:eastAsia="Consolas"/>
+          <w:color w:val="444444"/>
+          <w:sz w:val="19"/>
+        </w:rPr>
+        <w:t># ... hago mis cambios a los archivos ...</w:t>
+      </w:r>
+    </w:p>
+    <w:p>
+      <w:pPr>
+        <w:spacing w:after="0"/>
+        <w:ind w:left="360"/>
+        <w:shd w:val="clear" w:color="auto" w:fill="F2F5F9"/>
+      </w:pPr>
+      <w:r>
+        <w:rPr>
+          <w:rFonts w:ascii="Consolas" w:hAnsi="Consolas" w:eastAsia="Consolas"/>
+          <w:color w:val="444444"/>
+          <w:sz w:val="19"/>
+        </w:rPr>
+        <w:t>git status                              # 2. reviso qué cambié</w:t>
+      </w:r>
+    </w:p>
+    <w:p>
+      <w:pPr>
+        <w:spacing w:after="0"/>
+        <w:ind w:left="360"/>
+        <w:shd w:val="clear" w:color="auto" w:fill="F2F5F9"/>
+      </w:pPr>
+      <w:r>
+        <w:rPr>
+          <w:rFonts w:ascii="Consolas" w:hAnsi="Consolas" w:eastAsia="Consolas"/>
+          <w:color w:val="444444"/>
+          <w:sz w:val="19"/>
+        </w:rPr>
+        <w:t>git add .                               # 3. marco los cambios</w:t>
+      </w:r>
+    </w:p>
+    <w:p>
+      <w:pPr>
+        <w:spacing w:after="0"/>
+        <w:ind w:left="360"/>
+        <w:shd w:val="clear" w:color="auto" w:fill="F2F5F9"/>
+      </w:pPr>
+      <w:r>
+        <w:rPr>
+          <w:rFonts w:ascii="Consolas" w:hAnsi="Consolas" w:eastAsia="Consolas"/>
+          <w:color w:val="444444"/>
+          <w:sz w:val="19"/>
+        </w:rPr>
+        <w:t>git commit -m "Actualice el documento"  # 4. guardo la foto con su mensaje</w:t>
+      </w:r>
+    </w:p>
+    <w:p>
+      <w:pPr>
+        <w:spacing w:after="0"/>
+        <w:ind w:left="360"/>
+        <w:shd w:val="clear" w:color="auto" w:fill="F2F5F9"/>
+      </w:pPr>
+      <w:r>
+        <w:rPr>
+          <w:rFonts w:ascii="Consolas" w:hAnsi="Consolas" w:eastAsia="Consolas"/>
+          <w:color w:val="444444"/>
+          <w:sz w:val="19"/>
+        </w:rPr>
+        <w:t>git push                                # 5. lo subo al GitHub</w:t>
+      </w:r>
+    </w:p>
+    <w:p>
+      <w:pPr>
+        <w:spacing w:before="80" w:after="160"/>
+        <w:ind w:left="432"/>
+        <w:shd w:val="clear" w:color="auto" w:fill="EAF3EE"/>
+      </w:pPr>
+      <w:r>
+        <w:rPr>
+          <w:rFonts w:ascii="Calibri" w:hAnsi="Calibri" w:eastAsia="Calibri"/>
+          <w:b w:val="0"/>
+          <w:i/>
+          <w:color w:val="0A4D2E"/>
+        </w:rPr>
+        <w:t xml:space="preserve">⚠️ </w:t>
+      </w:r>
+      <w:r>
+        <w:rPr>
+          <w:rFonts w:ascii="Calibri" w:hAnsi="Calibri" w:eastAsia="Calibri"/>
+          <w:b/>
+          <w:i/>
+          <w:color w:val="0A4D2E"/>
+        </w:rPr>
+        <w:t>Reglas para no romper nada:</w:t>
+      </w:r>
+    </w:p>
+    <w:p>
+      <w:pPr>
+        <w:spacing w:before="80" w:after="160"/>
+        <w:ind w:left="432"/>
+        <w:shd w:val="clear" w:color="auto" w:fill="EAF3EE"/>
+      </w:pPr>
+      <w:r>
+        <w:rPr>
+          <w:rFonts w:ascii="Calibri" w:hAnsi="Calibri" w:eastAsia="Calibri"/>
+          <w:b w:val="0"/>
+          <w:i/>
+          <w:color w:val="0A4D2E"/>
+        </w:rPr>
+        <w:t xml:space="preserve">1. </w:t>
+      </w:r>
+      <w:r>
+        <w:rPr>
+          <w:rFonts w:ascii="Calibri" w:hAnsi="Calibri" w:eastAsia="Calibri"/>
+          <w:b/>
+          <w:i/>
+          <w:color w:val="0A4D2E"/>
+        </w:rPr>
+        <w:t>Siempre haz `git pull`</w:t>
+      </w:r>
+      <w:r>
+        <w:rPr>
+          <w:rFonts w:ascii="Calibri" w:hAnsi="Calibri" w:eastAsia="Calibri"/>
+          <w:b w:val="0"/>
+          <w:i/>
+          <w:color w:val="0A4D2E"/>
+        </w:rPr>
+        <w:t xml:space="preserve"> antes de empezar a editar.</w:t>
+      </w:r>
+    </w:p>
+    <w:p>
+      <w:pPr>
+        <w:spacing w:before="80" w:after="160"/>
+        <w:ind w:left="432"/>
+        <w:shd w:val="clear" w:color="auto" w:fill="EAF3EE"/>
+      </w:pPr>
+      <w:r>
+        <w:rPr>
+          <w:rFonts w:ascii="Calibri" w:hAnsi="Calibri" w:eastAsia="Calibri"/>
+          <w:b w:val="0"/>
+          <w:i/>
+          <w:color w:val="0A4D2E"/>
+        </w:rPr>
+        <w:t>2. No borres archivos que no conozcas.</w:t>
+      </w:r>
+    </w:p>
+    <w:p>
+      <w:pPr>
+        <w:spacing w:before="80" w:after="160"/>
+        <w:ind w:left="432"/>
+        <w:shd w:val="clear" w:color="auto" w:fill="EAF3EE"/>
+      </w:pPr>
+      <w:r>
+        <w:rPr>
+          <w:rFonts w:ascii="Calibri" w:hAnsi="Calibri" w:eastAsia="Calibri"/>
+          <w:b w:val="0"/>
+          <w:i/>
+          <w:color w:val="0A4D2E"/>
+        </w:rPr>
+        <w:t xml:space="preserve">3. Escribe mensajes de commit </w:t>
+      </w:r>
+      <w:r>
+        <w:rPr>
+          <w:rFonts w:ascii="Calibri" w:hAnsi="Calibri" w:eastAsia="Calibri"/>
+          <w:b/>
+          <w:i/>
+          <w:color w:val="0A4D2E"/>
+        </w:rPr>
+        <w:t>claros y en español</w:t>
+      </w:r>
+      <w:r>
+        <w:rPr>
+          <w:rFonts w:ascii="Calibri" w:hAnsi="Calibri" w:eastAsia="Calibri"/>
+          <w:b w:val="0"/>
+          <w:i/>
+          <w:color w:val="0A4D2E"/>
+        </w:rPr>
+        <w:t xml:space="preserve"> (ej: "Agrego validación del email").</w:t>
+      </w:r>
+    </w:p>
+    <w:p>
+      <w:pPr>
+        <w:spacing w:before="80" w:after="160"/>
+        <w:ind w:left="432"/>
+        <w:shd w:val="clear" w:color="auto" w:fill="EAF3EE"/>
+      </w:pPr>
+      <w:r>
+        <w:rPr>
+          <w:rFonts w:ascii="Calibri" w:hAnsi="Calibri" w:eastAsia="Calibri"/>
+          <w:b w:val="0"/>
+          <w:i/>
+          <w:color w:val="0A4D2E"/>
+        </w:rPr>
+        <w:t>4. Si algo "no se ve bien", avisa al coordinador (Cristian) antes de forzar cambios.</w:t>
+      </w:r>
+    </w:p>
+    <w:p>
+      <w:pPr>
+        <w:spacing w:before="80" w:after="160"/>
+        <w:ind w:left="432"/>
+        <w:shd w:val="clear" w:color="auto" w:fill="EAF3EE"/>
+      </w:pPr>
+      <w:r>
+        <w:rPr>
+          <w:rFonts w:ascii="Calibri" w:hAnsi="Calibri" w:eastAsia="Calibri"/>
+          <w:b w:val="0"/>
+          <w:i/>
+          <w:color w:val="0A4D2E"/>
+        </w:rPr>
+        <w:t xml:space="preserve">5. Los archivos </w:t>
+      </w:r>
+      <w:r>
+        <w:rPr>
+          <w:rFonts w:ascii="Consolas" w:hAnsi="Consolas" w:eastAsia="Consolas"/>
+          <w:b w:val="0"/>
+          <w:i/>
+          <w:color w:val="0A2342"/>
+          <w:sz w:val="21"/>
+        </w:rPr>
+        <w:t>.docx</w:t>
+      </w:r>
+      <w:r>
+        <w:rPr>
+          <w:rFonts w:ascii="Calibri" w:hAnsi="Calibri" w:eastAsia="Calibri"/>
+          <w:b w:val="0"/>
+          <w:i/>
+          <w:color w:val="0A4D2E"/>
+        </w:rPr>
+        <w:t xml:space="preserve">, </w:t>
+      </w:r>
+      <w:r>
+        <w:rPr>
+          <w:rFonts w:ascii="Consolas" w:hAnsi="Consolas" w:eastAsia="Consolas"/>
+          <w:b w:val="0"/>
+          <w:i/>
+          <w:color w:val="0A2342"/>
+          <w:sz w:val="21"/>
+        </w:rPr>
+        <w:t>.md</w:t>
+      </w:r>
+      <w:r>
+        <w:rPr>
+          <w:rFonts w:ascii="Calibri" w:hAnsi="Calibri" w:eastAsia="Calibri"/>
+          <w:b w:val="0"/>
+          <w:i/>
+          <w:color w:val="0A4D2E"/>
+        </w:rPr>
+        <w:t xml:space="preserve"> y el PDF no deben abrirse a la vez que otros: si dos</w:t>
+      </w:r>
+    </w:p>
+    <w:p>
+      <w:pPr>
+        <w:spacing w:before="80" w:after="160"/>
+        <w:ind w:left="432"/>
+        <w:shd w:val="clear" w:color="auto" w:fill="EAF3EE"/>
+      </w:pPr>
+      <w:r>
+        <w:rPr>
+          <w:rFonts w:ascii="Calibri" w:hAnsi="Calibri" w:eastAsia="Calibri"/>
+          <w:b w:val="0"/>
+          <w:i/>
+          <w:color w:val="0A4D2E"/>
+        </w:rPr>
+        <w:t>personas editan lo mismo al mismo tiempo, habrá conflictos.</w:t>
+      </w:r>
+    </w:p>
+    <w:p>
+      <w:pPr>
+        <w:spacing w:before="240"/>
+      </w:pPr>
+      <w:r>
+        <w:rPr>
+          <w:rFonts w:ascii="Calibri" w:hAnsi="Calibri" w:eastAsia="Calibri"/>
+          <w:b/>
+          <w:color w:val="1565C0"/>
+          <w:sz w:val="26"/>
+        </w:rPr>
+        <w:t>10.6 Cómo actualizar "el documento en físico" (el PDF)</w:t>
+      </w:r>
+    </w:p>
+    <w:p>
+      <w:r>
+        <w:rPr>
+          <w:rFonts w:ascii="Calibri" w:hAnsi="Calibri" w:eastAsia="Calibri"/>
+          <w:b w:val="0"/>
+          <w:i w:val="0"/>
+        </w:rPr>
+        <w:t xml:space="preserve">El PDF vive en la carpeta local </w:t>
+      </w:r>
+      <w:r>
+        <w:rPr>
+          <w:rFonts w:ascii="Consolas" w:hAnsi="Consolas" w:eastAsia="Consolas"/>
+          <w:b w:val="0"/>
+          <w:i w:val="0"/>
+          <w:color w:val="0A2342"/>
+          <w:sz w:val="21"/>
+        </w:rPr>
+        <w:t>Documento Explicativo del Código/</w:t>
+      </w:r>
+      <w:r>
+        <w:rPr>
+          <w:rFonts w:ascii="Calibri" w:hAnsi="Calibri" w:eastAsia="Calibri"/>
+          <w:b w:val="0"/>
+          <w:i w:val="0"/>
+        </w:rPr>
+        <w:t>. Cuando alguien</w:t>
+      </w:r>
+    </w:p>
+    <w:p>
+      <w:r>
+        <w:rPr>
+          <w:rFonts w:ascii="Calibri" w:hAnsi="Calibri" w:eastAsia="Calibri"/>
+          <w:b w:val="0"/>
+          <w:i w:val="0"/>
+        </w:rPr>
+        <w:t>actualice el documento fuente (</w:t>
+      </w:r>
+      <w:r>
+        <w:rPr>
+          <w:rFonts w:ascii="Consolas" w:hAnsi="Consolas" w:eastAsia="Consolas"/>
+          <w:b w:val="0"/>
+          <w:i w:val="0"/>
+          <w:color w:val="0A2342"/>
+          <w:sz w:val="21"/>
+        </w:rPr>
+        <w:t>.md</w:t>
+      </w:r>
+      <w:r>
+        <w:rPr>
+          <w:rFonts w:ascii="Calibri" w:hAnsi="Calibri" w:eastAsia="Calibri"/>
+          <w:b w:val="0"/>
+          <w:i w:val="0"/>
+        </w:rPr>
+        <w:t>), solo hay que:</w:t>
+      </w:r>
+    </w:p>
+    <w:p>
+      <w:pPr>
+        <w:pStyle w:val="ListNumber"/>
+        <w:spacing w:after="60"/>
+      </w:pPr>
+      <w:r>
+        <w:rPr>
+          <w:rFonts w:ascii="Calibri" w:hAnsi="Calibri" w:eastAsia="Calibri"/>
+          <w:b w:val="0"/>
+          <w:i w:val="0"/>
+        </w:rPr>
+        <w:t xml:space="preserve">Hacer </w:t>
+      </w:r>
+      <w:r>
+        <w:rPr>
+          <w:rFonts w:ascii="Consolas" w:hAnsi="Consolas" w:eastAsia="Consolas"/>
+          <w:b w:val="0"/>
+          <w:i w:val="0"/>
+          <w:color w:val="0A2342"/>
+          <w:sz w:val="21"/>
+        </w:rPr>
+        <w:t>git pull</w:t>
+      </w:r>
+      <w:r>
+        <w:rPr>
+          <w:rFonts w:ascii="Calibri" w:hAnsi="Calibri" w:eastAsia="Calibri"/>
+          <w:b w:val="0"/>
+          <w:i w:val="0"/>
+        </w:rPr>
+        <w:t xml:space="preserve"> para traer el </w:t>
+      </w:r>
+      <w:r>
+        <w:rPr>
+          <w:rFonts w:ascii="Consolas" w:hAnsi="Consolas" w:eastAsia="Consolas"/>
+          <w:b w:val="0"/>
+          <w:i w:val="0"/>
+          <w:color w:val="0A2342"/>
+          <w:sz w:val="21"/>
+        </w:rPr>
+        <w:t>.md</w:t>
+      </w:r>
+      <w:r>
+        <w:rPr>
+          <w:rFonts w:ascii="Calibri" w:hAnsi="Calibri" w:eastAsia="Calibri"/>
+          <w:b w:val="0"/>
+          <w:i w:val="0"/>
+        </w:rPr>
+        <w:t xml:space="preserve"> más nuevo.</w:t>
+      </w:r>
+    </w:p>
+    <w:p>
+      <w:pPr>
+        <w:pStyle w:val="ListNumber"/>
+        <w:spacing w:after="60"/>
+      </w:pPr>
+      <w:r>
+        <w:rPr>
+          <w:rFonts w:ascii="Calibri" w:hAnsi="Calibri" w:eastAsia="Calibri"/>
+          <w:b w:val="0"/>
+          <w:i w:val="0"/>
+        </w:rPr>
+        <w:t>Abrir la terminal en la raíz del proyecto.</w:t>
+      </w:r>
+    </w:p>
+    <w:p>
+      <w:pPr>
+        <w:pStyle w:val="ListNumber"/>
+        <w:spacing w:after="60"/>
+      </w:pPr>
+      <w:r>
+        <w:rPr>
+          <w:rFonts w:ascii="Calibri" w:hAnsi="Calibri" w:eastAsia="Calibri"/>
+          <w:b w:val="0"/>
+          <w:i w:val="0"/>
+        </w:rPr>
+        <w:t>Ejecutar:</w:t>
+      </w:r>
+    </w:p>
+    <w:p>
+      <w:pPr>
+        <w:spacing w:after="0"/>
+        <w:ind w:left="360"/>
+        <w:shd w:val="clear" w:color="auto" w:fill="F2F5F9"/>
+      </w:pPr>
+      <w:r>
+        <w:rPr>
+          <w:rFonts w:ascii="Consolas" w:hAnsi="Consolas" w:eastAsia="Consolas"/>
+          <w:color w:val="444444"/>
+          <w:sz w:val="19"/>
+        </w:rPr>
+        <w:t>py scripts\actualizar_documento.py</w:t>
+      </w:r>
+    </w:p>
+    <w:p>
+      <w:r>
+        <w:rPr>
+          <w:rFonts w:ascii="Calibri" w:hAnsi="Calibri" w:eastAsia="Calibri"/>
+          <w:b w:val="0"/>
+          <w:i w:val="0"/>
+        </w:rPr>
+        <w:t>Esto regenera el Word (</w:t>
+      </w:r>
+      <w:r>
+        <w:rPr>
+          <w:rFonts w:ascii="Consolas" w:hAnsi="Consolas" w:eastAsia="Consolas"/>
+          <w:b w:val="0"/>
+          <w:i w:val="0"/>
+          <w:color w:val="0A2342"/>
+          <w:sz w:val="21"/>
+        </w:rPr>
+        <w:t>.docx</w:t>
+      </w:r>
+      <w:r>
+        <w:rPr>
+          <w:rFonts w:ascii="Calibri" w:hAnsi="Calibri" w:eastAsia="Calibri"/>
+          <w:b w:val="0"/>
+          <w:i w:val="0"/>
+        </w:rPr>
+        <w:t>) y el PDF automáticamente. Después ya se puede imprimir</w:t>
+      </w:r>
+    </w:p>
+    <w:p>
+      <w:r>
+        <w:rPr>
+          <w:rFonts w:ascii="Calibri" w:hAnsi="Calibri" w:eastAsia="Calibri"/>
+          <w:b w:val="0"/>
+          <w:i w:val="0"/>
+        </w:rPr>
+        <w:t xml:space="preserve">o leer la versión nueva. </w:t>
+      </w:r>
+      <w:r>
+        <w:rPr>
+          <w:rFonts w:ascii="Calibri" w:hAnsi="Calibri" w:eastAsia="Calibri"/>
+          <w:b w:val="0"/>
+          <w:i/>
+        </w:rPr>
+        <w:t>(Requiere tener instalado Word para que se genere el PDF.)</w:t>
       </w:r>
     </w:p>
     <w:p>

</xml_diff>